<commit_message>
chore(US1, fichier de base): déplacement du joueur, restart à 0 avec le fichier de base
</commit_message>
<xml_diff>
--- a/docs/R-320-POO-SchmidNathan-Rapport.docx
+++ b/docs/R-320-POO-SchmidNathan-Rapport.docx
@@ -88,12 +88,11 @@
           <w:r>
             <w:fldChar w:fldCharType="separate"/>
           </w:r>
-          <w:hyperlink w:anchor="_Toc239427039" w:history="1">
+          <w:hyperlink w:anchor="_Toc241241767" w:history="1">
             <w:r>
               <w:rPr>
                 <w:rStyle w:val="Lienhypertexte"/>
                 <w:noProof/>
-                <w:lang w:val="en-US"/>
               </w:rPr>
               <w:t>Introduction</w:t>
             </w:r>
@@ -116,7 +115,7 @@
                 <w:noProof/>
                 <w:webHidden/>
               </w:rPr>
-              <w:instrText xml:space="preserve"> PAGEREF _Toc239427039 \h </w:instrText>
+              <w:instrText xml:space="preserve"> PAGEREF _Toc241241767 \h </w:instrText>
             </w:r>
             <w:r>
               <w:rPr>
@@ -159,7 +158,7 @@
               <w:lang w:eastAsia="fr-CH"/>
             </w:rPr>
           </w:pPr>
-          <w:hyperlink w:anchor="_Toc239427040" w:history="1">
+          <w:hyperlink w:anchor="_Toc241241768" w:history="1">
             <w:r>
               <w:rPr>
                 <w:rStyle w:val="Lienhypertexte"/>
@@ -186,7 +185,7 @@
                 <w:noProof/>
                 <w:webHidden/>
               </w:rPr>
-              <w:instrText xml:space="preserve"> PAGEREF _Toc239427040 \h </w:instrText>
+              <w:instrText xml:space="preserve"> PAGEREF _Toc241241768 \h </w:instrText>
             </w:r>
             <w:r>
               <w:rPr>
@@ -229,7 +228,7 @@
               <w:lang w:eastAsia="fr-CH"/>
             </w:rPr>
           </w:pPr>
-          <w:hyperlink w:anchor="_Toc239427041" w:history="1">
+          <w:hyperlink w:anchor="_Toc241241769" w:history="1">
             <w:r>
               <w:rPr>
                 <w:rStyle w:val="Lienhypertexte"/>
@@ -256,7 +255,7 @@
                 <w:noProof/>
                 <w:webHidden/>
               </w:rPr>
-              <w:instrText xml:space="preserve"> PAGEREF _Toc239427041 \h </w:instrText>
+              <w:instrText xml:space="preserve"> PAGEREF _Toc241241769 \h </w:instrText>
             </w:r>
             <w:r>
               <w:rPr>
@@ -299,7 +298,7 @@
               <w:lang w:eastAsia="fr-CH"/>
             </w:rPr>
           </w:pPr>
-          <w:hyperlink w:anchor="_Toc239427042" w:history="1">
+          <w:hyperlink w:anchor="_Toc241241770" w:history="1">
             <w:r>
               <w:rPr>
                 <w:rStyle w:val="Lienhypertexte"/>
@@ -326,7 +325,7 @@
                 <w:noProof/>
                 <w:webHidden/>
               </w:rPr>
-              <w:instrText xml:space="preserve"> PAGEREF _Toc239427042 \h </w:instrText>
+              <w:instrText xml:space="preserve"> PAGEREF _Toc241241770 \h </w:instrText>
             </w:r>
             <w:r>
               <w:rPr>
@@ -369,7 +368,7 @@
               <w:lang w:eastAsia="fr-CH"/>
             </w:rPr>
           </w:pPr>
-          <w:hyperlink w:anchor="_Toc239427043" w:history="1">
+          <w:hyperlink w:anchor="_Toc241241771" w:history="1">
             <w:r>
               <w:rPr>
                 <w:rStyle w:val="Lienhypertexte"/>
@@ -396,7 +395,7 @@
                 <w:noProof/>
                 <w:webHidden/>
               </w:rPr>
-              <w:instrText xml:space="preserve"> PAGEREF _Toc239427043 \h </w:instrText>
+              <w:instrText xml:space="preserve"> PAGEREF _Toc241241771 \h </w:instrText>
             </w:r>
             <w:r>
               <w:rPr>
@@ -439,12 +438,11 @@
               <w:lang w:eastAsia="fr-CH"/>
             </w:rPr>
           </w:pPr>
-          <w:hyperlink w:anchor="_Toc239427044" w:history="1">
+          <w:hyperlink w:anchor="_Toc241241772" w:history="1">
             <w:r>
               <w:rPr>
                 <w:rStyle w:val="Lienhypertexte"/>
                 <w:noProof/>
-                <w:lang w:val="en-US"/>
               </w:rPr>
               <w:t>U.S / user stories</w:t>
             </w:r>
@@ -467,7 +465,7 @@
                 <w:noProof/>
                 <w:webHidden/>
               </w:rPr>
-              <w:instrText xml:space="preserve"> PAGEREF _Toc239427044 \h </w:instrText>
+              <w:instrText xml:space="preserve"> PAGEREF _Toc241241772 \h </w:instrText>
             </w:r>
             <w:r>
               <w:rPr>
@@ -510,7 +508,7 @@
               <w:lang w:eastAsia="fr-CH"/>
             </w:rPr>
           </w:pPr>
-          <w:hyperlink w:anchor="_Toc239427045" w:history="1">
+          <w:hyperlink w:anchor="_Toc241241773" w:history="1">
             <w:r>
               <w:rPr>
                 <w:rStyle w:val="Lienhypertexte"/>
@@ -537,7 +535,7 @@
                 <w:noProof/>
                 <w:webHidden/>
               </w:rPr>
-              <w:instrText xml:space="preserve"> PAGEREF _Toc239427045 \h </w:instrText>
+              <w:instrText xml:space="preserve"> PAGEREF _Toc241241773 \h </w:instrText>
             </w:r>
             <w:r>
               <w:rPr>
@@ -580,7 +578,7 @@
               <w:lang w:eastAsia="fr-CH"/>
             </w:rPr>
           </w:pPr>
-          <w:hyperlink w:anchor="_Toc239427046" w:history="1">
+          <w:hyperlink w:anchor="_Toc241241774" w:history="1">
             <w:r>
               <w:rPr>
                 <w:rStyle w:val="Lienhypertexte"/>
@@ -607,7 +605,7 @@
                 <w:noProof/>
                 <w:webHidden/>
               </w:rPr>
-              <w:instrText xml:space="preserve"> PAGEREF _Toc239427046 \h </w:instrText>
+              <w:instrText xml:space="preserve"> PAGEREF _Toc241241774 \h </w:instrText>
             </w:r>
             <w:r>
               <w:rPr>
@@ -650,7 +648,7 @@
               <w:lang w:eastAsia="fr-CH"/>
             </w:rPr>
           </w:pPr>
-          <w:hyperlink w:anchor="_Toc239427047" w:history="1">
+          <w:hyperlink w:anchor="_Toc241241775" w:history="1">
             <w:r>
               <w:rPr>
                 <w:rStyle w:val="Lienhypertexte"/>
@@ -677,7 +675,7 @@
                 <w:noProof/>
                 <w:webHidden/>
               </w:rPr>
-              <w:instrText xml:space="preserve"> PAGEREF _Toc239427047 \h </w:instrText>
+              <w:instrText xml:space="preserve"> PAGEREF _Toc241241775 \h </w:instrText>
             </w:r>
             <w:r>
               <w:rPr>
@@ -720,7 +718,7 @@
               <w:lang w:eastAsia="fr-CH"/>
             </w:rPr>
           </w:pPr>
-          <w:hyperlink w:anchor="_Toc239427048" w:history="1">
+          <w:hyperlink w:anchor="_Toc241241776" w:history="1">
             <w:r>
               <w:rPr>
                 <w:rStyle w:val="Lienhypertexte"/>
@@ -747,7 +745,7 @@
                 <w:noProof/>
                 <w:webHidden/>
               </w:rPr>
-              <w:instrText xml:space="preserve"> PAGEREF _Toc239427048 \h </w:instrText>
+              <w:instrText xml:space="preserve"> PAGEREF _Toc241241776 \h </w:instrText>
             </w:r>
             <w:r>
               <w:rPr>
@@ -790,7 +788,7 @@
               <w:lang w:eastAsia="fr-CH"/>
             </w:rPr>
           </w:pPr>
-          <w:hyperlink w:anchor="_Toc239427049" w:history="1">
+          <w:hyperlink w:anchor="_Toc241241777" w:history="1">
             <w:r>
               <w:rPr>
                 <w:rStyle w:val="Lienhypertexte"/>
@@ -817,7 +815,7 @@
                 <w:noProof/>
                 <w:webHidden/>
               </w:rPr>
-              <w:instrText xml:space="preserve"> PAGEREF _Toc239427049 \h </w:instrText>
+              <w:instrText xml:space="preserve"> PAGEREF _Toc241241777 \h </w:instrText>
             </w:r>
             <w:r>
               <w:rPr>
@@ -860,7 +858,7 @@
               <w:lang w:eastAsia="fr-CH"/>
             </w:rPr>
           </w:pPr>
-          <w:hyperlink w:anchor="_Toc239427050" w:history="1">
+          <w:hyperlink w:anchor="_Toc241241778" w:history="1">
             <w:r>
               <w:rPr>
                 <w:rStyle w:val="Lienhypertexte"/>
@@ -887,7 +885,7 @@
                 <w:noProof/>
                 <w:webHidden/>
               </w:rPr>
-              <w:instrText xml:space="preserve"> PAGEREF _Toc239427050 \h </w:instrText>
+              <w:instrText xml:space="preserve"> PAGEREF _Toc241241778 \h </w:instrText>
             </w:r>
             <w:r>
               <w:rPr>
@@ -930,12 +928,11 @@
               <w:lang w:eastAsia="fr-CH"/>
             </w:rPr>
           </w:pPr>
-          <w:hyperlink w:anchor="_Toc239427051" w:history="1">
+          <w:hyperlink w:anchor="_Toc241241779" w:history="1">
             <w:r>
               <w:rPr>
                 <w:rStyle w:val="Lienhypertexte"/>
                 <w:noProof/>
-                <w:lang w:val="en-US"/>
               </w:rPr>
               <w:t>Semaine 6</w:t>
             </w:r>
@@ -958,7 +955,7 @@
                 <w:noProof/>
                 <w:webHidden/>
               </w:rPr>
-              <w:instrText xml:space="preserve"> PAGEREF _Toc239427051 \h </w:instrText>
+              <w:instrText xml:space="preserve"> PAGEREF _Toc241241779 \h </w:instrText>
             </w:r>
             <w:r>
               <w:rPr>
@@ -1001,7 +998,7 @@
               <w:lang w:eastAsia="fr-CH"/>
             </w:rPr>
           </w:pPr>
-          <w:hyperlink w:anchor="_Toc239427052" w:history="1">
+          <w:hyperlink w:anchor="_Toc241241780" w:history="1">
             <w:r>
               <w:rPr>
                 <w:rStyle w:val="Lienhypertexte"/>
@@ -1029,7 +1026,7 @@
                 <w:noProof/>
                 <w:webHidden/>
               </w:rPr>
-              <w:instrText xml:space="preserve"> PAGEREF _Toc239427052 \h </w:instrText>
+              <w:instrText xml:space="preserve"> PAGEREF _Toc241241780 \h </w:instrText>
             </w:r>
             <w:r>
               <w:rPr>
@@ -1049,7 +1046,7 @@
                 <w:noProof/>
                 <w:webHidden/>
               </w:rPr>
-              <w:t>3</w:t>
+              <w:t>4</w:t>
             </w:r>
             <w:r>
               <w:rPr>
@@ -1072,7 +1069,7 @@
               <w:lang w:eastAsia="fr-CH"/>
             </w:rPr>
           </w:pPr>
-          <w:hyperlink w:anchor="_Toc239427053" w:history="1">
+          <w:hyperlink w:anchor="_Toc241241781" w:history="1">
             <w:r>
               <w:rPr>
                 <w:rStyle w:val="Lienhypertexte"/>
@@ -1100,7 +1097,7 @@
                 <w:noProof/>
                 <w:webHidden/>
               </w:rPr>
-              <w:instrText xml:space="preserve"> PAGEREF _Toc239427053 \h </w:instrText>
+              <w:instrText xml:space="preserve"> PAGEREF _Toc241241781 \h </w:instrText>
             </w:r>
             <w:r>
               <w:rPr>
@@ -1120,7 +1117,7 @@
                 <w:noProof/>
                 <w:webHidden/>
               </w:rPr>
-              <w:t>3</w:t>
+              <w:t>4</w:t>
             </w:r>
             <w:r>
               <w:rPr>
@@ -1163,7 +1160,7 @@
         <w:jc w:val="center"/>
       </w:pPr>
       <w:r>
-        <w:t>Auteur:</w:t>
+        <w:t>Auteur :</w:t>
       </w:r>
       <w:r>
         <w:t xml:space="preserve"> Nathan Schmid</w:t>
@@ -1186,7 +1183,7 @@
       <w:pPr>
         <w:pStyle w:val="Titre1"/>
       </w:pPr>
-      <w:bookmarkStart w:id="0" w:name="_Toc239427039"/>
+      <w:bookmarkStart w:id="0" w:name="_Toc241241767"/>
       <w:r>
         <w:t>Introduction</w:t>
       </w:r>
@@ -1217,7 +1214,7 @@
       <w:pPr>
         <w:pStyle w:val="Titre1"/>
       </w:pPr>
-      <w:bookmarkStart w:id="1" w:name="_Toc239427040"/>
+      <w:bookmarkStart w:id="1" w:name="_Toc241241768"/>
       <w:r>
         <w:lastRenderedPageBreak/>
         <w:t>Contexte</w:t>
@@ -1233,7 +1230,7 @@
       <w:pPr>
         <w:pStyle w:val="Titre1"/>
       </w:pPr>
-      <w:bookmarkStart w:id="2" w:name="_Toc239427041"/>
+      <w:bookmarkStart w:id="2" w:name="_Toc241241769"/>
       <w:r>
         <w:t>Objectif principal</w:t>
       </w:r>
@@ -1248,7 +1245,7 @@
       <w:pPr>
         <w:pStyle w:val="Titre1"/>
       </w:pPr>
-      <w:bookmarkStart w:id="3" w:name="_Toc239427042"/>
+      <w:bookmarkStart w:id="3" w:name="_Toc241241770"/>
       <w:r>
         <w:t>Maquettes</w:t>
       </w:r>
@@ -1321,7 +1318,7 @@
       <w:pPr>
         <w:pStyle w:val="Titre1"/>
       </w:pPr>
-      <w:bookmarkStart w:id="4" w:name="_Toc239427043"/>
+      <w:bookmarkStart w:id="4" w:name="_Toc241241771"/>
       <w:r>
         <w:t>Analyse</w:t>
       </w:r>
@@ -1331,7 +1328,7 @@
       <w:pPr>
         <w:pStyle w:val="Titre2"/>
       </w:pPr>
-      <w:bookmarkStart w:id="5" w:name="_Toc239427044"/>
+      <w:bookmarkStart w:id="5" w:name="_Toc241241772"/>
       <w:r>
         <w:t>U.S</w:t>
       </w:r>
@@ -1466,7 +1463,7 @@
       <w:pPr>
         <w:pStyle w:val="Titre1"/>
       </w:pPr>
-      <w:bookmarkStart w:id="6" w:name="_Toc239427045"/>
+      <w:bookmarkStart w:id="6" w:name="_Toc241241773"/>
       <w:r>
         <w:t>Planification</w:t>
       </w:r>
@@ -1476,7 +1473,7 @@
       <w:pPr>
         <w:pStyle w:val="Titre2"/>
       </w:pPr>
-      <w:bookmarkStart w:id="7" w:name="_Toc239427046"/>
+      <w:bookmarkStart w:id="7" w:name="_Toc241241774"/>
       <w:r>
         <w:t>Semaine 1</w:t>
       </w:r>
@@ -1549,7 +1546,7 @@
       <w:pPr>
         <w:pStyle w:val="Titre2"/>
       </w:pPr>
-      <w:bookmarkStart w:id="8" w:name="_Toc239427047"/>
+      <w:bookmarkStart w:id="8" w:name="_Toc241241775"/>
       <w:r>
         <w:t>Semaine 2</w:t>
       </w:r>
@@ -1604,7 +1601,7 @@
       <w:pPr>
         <w:pStyle w:val="Titre2"/>
       </w:pPr>
-      <w:bookmarkStart w:id="9" w:name="_Toc239427048"/>
+      <w:bookmarkStart w:id="9" w:name="_Toc241241776"/>
       <w:r>
         <w:t>Semaine 3</w:t>
       </w:r>
@@ -1646,7 +1643,7 @@
       <w:pPr>
         <w:pStyle w:val="Titre2"/>
       </w:pPr>
-      <w:bookmarkStart w:id="10" w:name="_Toc239427049"/>
+      <w:bookmarkStart w:id="10" w:name="_Toc241241777"/>
       <w:r>
         <w:t>Semaine 4</w:t>
       </w:r>
@@ -1680,7 +1677,7 @@
       <w:pPr>
         <w:pStyle w:val="Titre2"/>
       </w:pPr>
-      <w:bookmarkStart w:id="11" w:name="_Toc239427050"/>
+      <w:bookmarkStart w:id="11" w:name="_Toc241241778"/>
       <w:r>
         <w:t>Semaine 5</w:t>
       </w:r>
@@ -1708,7 +1705,7 @@
       <w:pPr>
         <w:pStyle w:val="Titre2"/>
       </w:pPr>
-      <w:bookmarkStart w:id="12" w:name="_Toc239427051"/>
+      <w:bookmarkStart w:id="12" w:name="_Toc241241779"/>
       <w:r>
         <w:t>Semaine 6</w:t>
       </w:r>
@@ -1751,7 +1748,7 @@
           <w:lang w:val="en-US"/>
         </w:rPr>
       </w:pPr>
-      <w:bookmarkStart w:id="13" w:name="_Toc239427052"/>
+      <w:bookmarkStart w:id="13" w:name="_Toc241241780"/>
       <w:proofErr w:type="spellStart"/>
       <w:r>
         <w:rPr>
@@ -1818,7 +1815,7 @@
           <w:lang w:val="en-US"/>
         </w:rPr>
       </w:pPr>
-      <w:bookmarkStart w:id="14" w:name="_Toc239427053"/>
+      <w:bookmarkStart w:id="14" w:name="_Toc241241781"/>
       <w:proofErr w:type="spellStart"/>
       <w:r>
         <w:rPr>
@@ -3391,10 +3388,23 @@
 </file>
 
 <file path=customXml/item1.xml><?xml version="1.0" encoding="utf-8"?>
-<b:Sources xmlns:b="http://schemas.openxmlformats.org/officeDocument/2006/bibliography" xmlns="http://schemas.openxmlformats.org/officeDocument/2006/bibliography" SelectedStyle="\APASixthEditionOfficeOnline.xsl" StyleName="APA" Version="6"/>
+<p:properties xmlns:p="http://schemas.microsoft.com/office/2006/metadata/properties" xmlns:xsi="http://www.w3.org/2001/XMLSchema-instance" xmlns:pc="http://schemas.microsoft.com/office/infopath/2007/PartnerControls">
+  <documentManagement>
+    <_activity xmlns="6cf9629a-3f6c-4f5f-bf5a-9990f6d83c58" xsi:nil="true"/>
+  </documentManagement>
+</p:properties>
 </file>
 
 <file path=customXml/item2.xml><?xml version="1.0" encoding="utf-8"?>
+<?mso-contentType ?>
+<FormTemplates xmlns="http://schemas.microsoft.com/sharepoint/v3/contenttype/forms">
+  <Display>DocumentLibraryForm</Display>
+  <Edit>DocumentLibraryForm</Edit>
+  <New>DocumentLibraryForm</New>
+</FormTemplates>
+</file>
+
+<file path=customXml/item3.xml><?xml version="1.0" encoding="utf-8"?>
 <ct:contentTypeSchema xmlns:ct="http://schemas.microsoft.com/office/2006/metadata/contentType" xmlns:ma="http://schemas.microsoft.com/office/2006/metadata/properties/metaAttributes" ct:_="" ma:_="" ma:contentTypeName="Document" ma:contentTypeID="0x0101008A44E17421B74B4385ED2944255AEAB1" ma:contentTypeVersion="15" ma:contentTypeDescription="Crée un document." ma:contentTypeScope="" ma:versionID="93b5b18248b291ae417a942065f70d11">
   <xsd:schema xmlns:xsd="http://www.w3.org/2001/XMLSchema" xmlns:xs="http://www.w3.org/2001/XMLSchema" xmlns:p="http://schemas.microsoft.com/office/2006/metadata/properties" xmlns:ns3="6cf9629a-3f6c-4f5f-bf5a-9990f6d83c58" xmlns:ns4="ef367ba7-2429-4e09-a0d8-fa435a6b45cb" targetNamespace="http://schemas.microsoft.com/office/2006/metadata/properties" ma:root="true" ma:fieldsID="eb702e15d063576a5a91b0ad2108833a" ns3:_="" ns4:_="">
     <xsd:import namespace="6cf9629a-3f6c-4f5f-bf5a-9990f6d83c58"/>
@@ -3627,32 +3637,29 @@
 </ct:contentTypeSchema>
 </file>
 
-<file path=customXml/item3.xml><?xml version="1.0" encoding="utf-8"?>
-<?mso-contentType ?>
-<FormTemplates xmlns="http://schemas.microsoft.com/sharepoint/v3/contenttype/forms">
-  <Display>DocumentLibraryForm</Display>
-  <Edit>DocumentLibraryForm</Edit>
-  <New>DocumentLibraryForm</New>
-</FormTemplates>
-</file>
-
 <file path=customXml/item4.xml><?xml version="1.0" encoding="utf-8"?>
-<p:properties xmlns:p="http://schemas.microsoft.com/office/2006/metadata/properties" xmlns:xsi="http://www.w3.org/2001/XMLSchema-instance" xmlns:pc="http://schemas.microsoft.com/office/infopath/2007/PartnerControls">
-  <documentManagement>
-    <_activity xmlns="6cf9629a-3f6c-4f5f-bf5a-9990f6d83c58" xsi:nil="true"/>
-  </documentManagement>
-</p:properties>
+<b:Sources xmlns:b="http://schemas.openxmlformats.org/officeDocument/2006/bibliography" xmlns="http://schemas.openxmlformats.org/officeDocument/2006/bibliography" SelectedStyle="\APASixthEditionOfficeOnline.xsl" StyleName="APA" Version="6"/>
 </file>
 
 <file path=customXml/itemProps1.xml><?xml version="1.0" encoding="utf-8"?>
-<ds:datastoreItem xmlns:ds="http://schemas.openxmlformats.org/officeDocument/2006/customXml" ds:itemID="{2C53BA18-DBA6-435B-B859-AC3BE7A8B3B8}">
+<ds:datastoreItem xmlns:ds="http://schemas.openxmlformats.org/officeDocument/2006/customXml" ds:itemID="{FC71E993-84B4-48D2-950C-13C131ED85B2}">
   <ds:schemaRefs>
-    <ds:schemaRef ds:uri="http://schemas.openxmlformats.org/officeDocument/2006/bibliography"/>
+    <ds:schemaRef ds:uri="http://schemas.microsoft.com/office/2006/metadata/properties"/>
+    <ds:schemaRef ds:uri="http://schemas.microsoft.com/office/infopath/2007/PartnerControls"/>
+    <ds:schemaRef ds:uri="6cf9629a-3f6c-4f5f-bf5a-9990f6d83c58"/>
   </ds:schemaRefs>
 </ds:datastoreItem>
 </file>
 
 <file path=customXml/itemProps2.xml><?xml version="1.0" encoding="utf-8"?>
+<ds:datastoreItem xmlns:ds="http://schemas.openxmlformats.org/officeDocument/2006/customXml" ds:itemID="{FEB6B610-A6D6-49E3-96B6-D5561D46B112}">
+  <ds:schemaRefs>
+    <ds:schemaRef ds:uri="http://schemas.microsoft.com/sharepoint/v3/contenttype/forms"/>
+  </ds:schemaRefs>
+</ds:datastoreItem>
+</file>
+
+<file path=customXml/itemProps3.xml><?xml version="1.0" encoding="utf-8"?>
 <ds:datastoreItem xmlns:ds="http://schemas.openxmlformats.org/officeDocument/2006/customXml" ds:itemID="{4B077741-96F4-4963-97B4-37B81EC3BF78}">
   <ds:schemaRefs>
     <ds:schemaRef ds:uri="http://schemas.microsoft.com/office/2006/metadata/contentType"/>
@@ -3671,20 +3678,10 @@
 </ds:datastoreItem>
 </file>
 
-<file path=customXml/itemProps3.xml><?xml version="1.0" encoding="utf-8"?>
-<ds:datastoreItem xmlns:ds="http://schemas.openxmlformats.org/officeDocument/2006/customXml" ds:itemID="{FEB6B610-A6D6-49E3-96B6-D5561D46B112}">
+<file path=customXml/itemProps4.xml><?xml version="1.0" encoding="utf-8"?>
+<ds:datastoreItem xmlns:ds="http://schemas.openxmlformats.org/officeDocument/2006/customXml" ds:itemID="{2C53BA18-DBA6-435B-B859-AC3BE7A8B3B8}">
   <ds:schemaRefs>
-    <ds:schemaRef ds:uri="http://schemas.microsoft.com/sharepoint/v3/contenttype/forms"/>
-  </ds:schemaRefs>
-</ds:datastoreItem>
-</file>
-
-<file path=customXml/itemProps4.xml><?xml version="1.0" encoding="utf-8"?>
-<ds:datastoreItem xmlns:ds="http://schemas.openxmlformats.org/officeDocument/2006/customXml" ds:itemID="{FC71E993-84B4-48D2-950C-13C131ED85B2}">
-  <ds:schemaRefs>
-    <ds:schemaRef ds:uri="http://schemas.microsoft.com/office/2006/metadata/properties"/>
-    <ds:schemaRef ds:uri="http://schemas.microsoft.com/office/infopath/2007/PartnerControls"/>
-    <ds:schemaRef ds:uri="6cf9629a-3f6c-4f5f-bf5a-9990f6d83c58"/>
+    <ds:schemaRef ds:uri="http://schemas.openxmlformats.org/officeDocument/2006/bibliography"/>
   </ds:schemaRefs>
 </ds:datastoreItem>
 </file>
</xml_diff>

<commit_message>
chore(tests): ajout de test unitaires
</commit_message>
<xml_diff>
--- a/docs/R-320-POO-SchmidNathan-Rapport.docx
+++ b/docs/R-320-POO-SchmidNathan-Rapport.docx
@@ -1446,6 +1446,14 @@
       </w:r>
     </w:p>
     <w:p>
+      <w:pPr>
+        <w:ind w:left="360"/>
+      </w:pPr>
+    </w:p>
+    <w:p>
+      <w:pPr>
+        <w:ind w:left="360"/>
+      </w:pPr>
       <w:r>
         <w:t>En tant que joueur je veux avoir 5 défenses afin de me protéger des tirs ennemis.</w:t>
       </w:r>
@@ -1455,10 +1463,484 @@
         <w:pStyle w:val="Paragraphedeliste"/>
         <w:numPr>
           <w:ilvl w:val="0"/>
-          <w:numId w:val="2"/>
+          <w:numId w:val="3"/>
         </w:numPr>
       </w:pPr>
-    </w:p>
+      <w:r>
+        <w:t>Il y a 5 défenses en forme de feuille de chêne.</w:t>
+      </w:r>
+    </w:p>
+    <w:p>
+      <w:pPr>
+        <w:pStyle w:val="Paragraphedeliste"/>
+        <w:numPr>
+          <w:ilvl w:val="0"/>
+          <w:numId w:val="3"/>
+        </w:numPr>
+      </w:pPr>
+      <w:r>
+        <w:t>Chacune des défenses ne se déplacera pas, ou ne pourra pas être déplacée.</w:t>
+      </w:r>
+    </w:p>
+    <w:p>
+      <w:pPr>
+        <w:pStyle w:val="Paragraphedeliste"/>
+        <w:numPr>
+          <w:ilvl w:val="0"/>
+          <w:numId w:val="3"/>
+        </w:numPr>
+      </w:pPr>
+      <w:r>
+        <w:t xml:space="preserve">Elles feront office de bouclier contre les projectiles ennemis, plus les projectiles atteigne les défenses, plus la défense se détériore </w:t>
+      </w:r>
+      <w:proofErr w:type="spellStart"/>
+      <w:r>
+        <w:t>juqu'a</w:t>
+      </w:r>
+      <w:proofErr w:type="spellEnd"/>
+      <w:r>
+        <w:t xml:space="preserve"> se détruire.</w:t>
+      </w:r>
+    </w:p>
+    <w:p>
+      <w:pPr>
+        <w:pStyle w:val="Paragraphedeliste"/>
+        <w:numPr>
+          <w:ilvl w:val="0"/>
+          <w:numId w:val="3"/>
+        </w:numPr>
+      </w:pPr>
+      <w:r>
+        <w:t>La feuille de chêne se détruira après 10 projectiles ennemis.</w:t>
+      </w:r>
+    </w:p>
+    <w:p>
+      <w:pPr>
+        <w:pStyle w:val="Paragraphedeliste"/>
+        <w:numPr>
+          <w:ilvl w:val="0"/>
+          <w:numId w:val="3"/>
+        </w:numPr>
+      </w:pPr>
+      <w:r>
+        <w:t>Les feuilles ne font pas office de bouclier pour les projectiles du joueur, les noisettes passent à travers.</w:t>
+      </w:r>
+    </w:p>
+    <w:p/>
+    <w:p>
+      <w:r>
+        <w:t>En tant que joueur je veux tirer des noisettes afin de pouvoir éliminer l’ennemi.</w:t>
+      </w:r>
+    </w:p>
+    <w:p>
+      <w:pPr>
+        <w:pStyle w:val="Paragraphedeliste"/>
+      </w:pPr>
+    </w:p>
+    <w:p>
+      <w:pPr>
+        <w:pStyle w:val="Paragraphedeliste"/>
+        <w:numPr>
+          <w:ilvl w:val="0"/>
+          <w:numId w:val="4"/>
+        </w:numPr>
+      </w:pPr>
+      <w:r>
+        <w:t>Si le joueur appuie sur la touche ESPACE alors une noisette tombe en direction du sol depuis la position du personnage.</w:t>
+      </w:r>
+    </w:p>
+    <w:p>
+      <w:pPr>
+        <w:pStyle w:val="Paragraphedeliste"/>
+        <w:numPr>
+          <w:ilvl w:val="0"/>
+          <w:numId w:val="4"/>
+        </w:numPr>
+      </w:pPr>
+      <w:r>
+        <w:t>Si le joueur reste appuyer sur la touche ESPACE alors le personnage ne lâchera que 1 noisette en direction du sol.</w:t>
+      </w:r>
+    </w:p>
+    <w:p>
+      <w:pPr>
+        <w:pStyle w:val="Paragraphedeliste"/>
+        <w:numPr>
+          <w:ilvl w:val="0"/>
+          <w:numId w:val="4"/>
+        </w:numPr>
+      </w:pPr>
+      <w:r>
+        <w:t>Le joueur doit appuyer plusieurs fois pour faire tomber des noisettes.</w:t>
+      </w:r>
+    </w:p>
+    <w:p>
+      <w:pPr>
+        <w:pStyle w:val="Paragraphedeliste"/>
+        <w:numPr>
+          <w:ilvl w:val="0"/>
+          <w:numId w:val="4"/>
+        </w:numPr>
+      </w:pPr>
+      <w:r>
+        <w:t>Si le joueur appuie à répétition sur la touche ESPACE alors il y aura un temps entre les noisettes qui tombe. Le joueur ne peut pas lâcher plusieurs noisettes à la fois.</w:t>
+      </w:r>
+    </w:p>
+    <w:p>
+      <w:pPr>
+        <w:pStyle w:val="Paragraphedeliste"/>
+        <w:numPr>
+          <w:ilvl w:val="0"/>
+          <w:numId w:val="4"/>
+        </w:numPr>
+      </w:pPr>
+      <w:r>
+        <w:t>Les noisettes font un certain nombre de dégâts qui élimine que certaines guêpes.</w:t>
+      </w:r>
+    </w:p>
+    <w:p>
+      <w:pPr>
+        <w:pStyle w:val="Paragraphedeliste"/>
+        <w:numPr>
+          <w:ilvl w:val="0"/>
+          <w:numId w:val="4"/>
+        </w:numPr>
+      </w:pPr>
+      <w:r>
+        <w:t>Si un projectile du joueur ne touche aucun ennemi, alors au contact du sol le projectile se détruit.</w:t>
+      </w:r>
+    </w:p>
+    <w:p>
+      <w:pPr>
+        <w:pStyle w:val="Paragraphedeliste"/>
+        <w:numPr>
+          <w:ilvl w:val="0"/>
+          <w:numId w:val="4"/>
+        </w:numPr>
+      </w:pPr>
+      <w:r>
+        <w:t>Lorsqu’un</w:t>
+      </w:r>
+      <w:r>
+        <w:t xml:space="preserve"> projectile touche un ennemi, le projectile se détruit.</w:t>
+      </w:r>
+    </w:p>
+    <w:p/>
+    <w:p>
+      <w:r>
+        <w:t>En tant que développeur je veux avoir des ennemis afin d'avoir un jeu dynamique et jouable.</w:t>
+      </w:r>
+    </w:p>
+    <w:p>
+      <w:r>
+        <w:t>Les ennemis se déplacent de gauche à droite.</w:t>
+      </w:r>
+    </w:p>
+    <w:p>
+      <w:r>
+        <w:t>Il existe plusieurs types d'ennemis :</w:t>
+      </w:r>
+    </w:p>
+    <w:p>
+      <w:pPr>
+        <w:numPr>
+          <w:ilvl w:val="0"/>
+          <w:numId w:val="6"/>
+        </w:numPr>
+      </w:pPr>
+      <w:r>
+        <w:t>L'ennemi de base : il se déplace et lance des projectiles sur le joueur.</w:t>
+      </w:r>
+    </w:p>
+    <w:p>
+      <w:pPr>
+        <w:numPr>
+          <w:ilvl w:val="0"/>
+          <w:numId w:val="6"/>
+        </w:numPr>
+      </w:pPr>
+      <w:r>
+        <w:lastRenderedPageBreak/>
+        <w:t>TANK : celui qui a plus de vie, qui est défini par sa couleur brune et sa taille (ou grandeur).</w:t>
+      </w:r>
+    </w:p>
+    <w:p>
+      <w:pPr>
+        <w:numPr>
+          <w:ilvl w:val="0"/>
+          <w:numId w:val="6"/>
+        </w:numPr>
+      </w:pPr>
+      <w:r>
+        <w:t xml:space="preserve">ARTILLERY : celui qui lance 1 </w:t>
+      </w:r>
+      <w:proofErr w:type="spellStart"/>
+      <w:r>
+        <w:t>prjectile</w:t>
+      </w:r>
+      <w:proofErr w:type="spellEnd"/>
+      <w:r>
+        <w:t xml:space="preserve"> comme l'ennemi de base, qui est défini par sa couleur noire.</w:t>
+      </w:r>
+    </w:p>
+    <w:p>
+      <w:pPr>
+        <w:numPr>
+          <w:ilvl w:val="0"/>
+          <w:numId w:val="6"/>
+        </w:numPr>
+      </w:pPr>
+      <w:r>
+        <w:t xml:space="preserve">SPEED : celui qui lance des projectiles qui font plus de </w:t>
+      </w:r>
+      <w:proofErr w:type="spellStart"/>
+      <w:r>
+        <w:t>dégats</w:t>
+      </w:r>
+      <w:proofErr w:type="spellEnd"/>
+      <w:r>
+        <w:t>.</w:t>
+      </w:r>
+    </w:p>
+    <w:p>
+      <w:r>
+        <w:t xml:space="preserve">Tous les ennemis ont 100 PV (points de vie), sauf le TANK qui </w:t>
+      </w:r>
+      <w:proofErr w:type="gramStart"/>
+      <w:r>
+        <w:t>a</w:t>
+      </w:r>
+      <w:proofErr w:type="gramEnd"/>
+      <w:r>
+        <w:t xml:space="preserve"> 150 PV, et le SPEED qui </w:t>
+      </w:r>
+      <w:proofErr w:type="gramStart"/>
+      <w:r>
+        <w:t>a</w:t>
+      </w:r>
+      <w:proofErr w:type="gramEnd"/>
+      <w:r>
+        <w:t xml:space="preserve"> 80 PV.</w:t>
+      </w:r>
+    </w:p>
+    <w:p>
+      <w:r>
+        <w:t>Tous les ennemis lancent des projectiles. Ils lancent tous les mêmes, sauf le SPEED qui fait plus de dégâts avec des projectiles électrifiés.</w:t>
+      </w:r>
+      <w:r>
+        <w:br/>
+        <w:t xml:space="preserve">Quand </w:t>
+      </w:r>
+      <w:proofErr w:type="gramStart"/>
+      <w:r>
+        <w:t>un ennemis</w:t>
+      </w:r>
+      <w:proofErr w:type="gramEnd"/>
+      <w:r>
+        <w:t xml:space="preserve"> n'as plus de PV alors il meurt, et il disparait.</w:t>
+      </w:r>
+      <w:r>
+        <w:br/>
+        <w:t xml:space="preserve">Quand un </w:t>
+      </w:r>
+      <w:proofErr w:type="spellStart"/>
+      <w:r>
+        <w:t>ennnemis</w:t>
+      </w:r>
+      <w:proofErr w:type="spellEnd"/>
+      <w:r>
+        <w:t xml:space="preserve"> prend des </w:t>
+      </w:r>
+      <w:proofErr w:type="spellStart"/>
+      <w:r>
+        <w:t>dégats</w:t>
+      </w:r>
+      <w:proofErr w:type="spellEnd"/>
+      <w:r>
+        <w:t xml:space="preserve"> il ne fait rien de spécial, l'ennemi continue </w:t>
+      </w:r>
+      <w:proofErr w:type="spellStart"/>
+      <w:r>
+        <w:t>a</w:t>
+      </w:r>
+      <w:proofErr w:type="spellEnd"/>
+      <w:r>
+        <w:t xml:space="preserve"> faire sa tâches de base.</w:t>
+      </w:r>
+    </w:p>
+    <w:p/>
+    <w:p>
+      <w:r>
+        <w:t>En tant que joueur je veux voir mon score afficher afin de pouvoir suivre ma progression.</w:t>
+      </w:r>
+    </w:p>
+    <w:p>
+      <w:r>
+        <w:t xml:space="preserve">Le score est affiché en haut </w:t>
+      </w:r>
+      <w:proofErr w:type="spellStart"/>
+      <w:r>
+        <w:t>a</w:t>
+      </w:r>
+      <w:proofErr w:type="spellEnd"/>
+      <w:r>
+        <w:t xml:space="preserve"> </w:t>
+      </w:r>
+      <w:r>
+        <w:t>gauche</w:t>
+      </w:r>
+      <w:r>
+        <w:t xml:space="preserve"> sur l'écran</w:t>
+      </w:r>
+      <w:r>
+        <w:br/>
+        <w:t>Le score est bien visible pour le joueur</w:t>
+      </w:r>
+      <w:r>
+        <w:br/>
+        <w:t xml:space="preserve">Il augmente quand </w:t>
+      </w:r>
+      <w:proofErr w:type="gramStart"/>
+      <w:r>
+        <w:t>un ennemis</w:t>
+      </w:r>
+      <w:proofErr w:type="gramEnd"/>
+      <w:r>
+        <w:t xml:space="preserve"> est </w:t>
+      </w:r>
+      <w:proofErr w:type="gramStart"/>
+      <w:r>
+        <w:t>éliminer:</w:t>
+      </w:r>
+      <w:proofErr w:type="gramEnd"/>
+    </w:p>
+    <w:p>
+      <w:pPr>
+        <w:numPr>
+          <w:ilvl w:val="0"/>
+          <w:numId w:val="7"/>
+        </w:numPr>
+      </w:pPr>
+      <w:r>
+        <w:t xml:space="preserve">Le score fait + 50 a </w:t>
+      </w:r>
+      <w:proofErr w:type="spellStart"/>
+      <w:r>
+        <w:t>chaques</w:t>
+      </w:r>
+      <w:proofErr w:type="spellEnd"/>
+      <w:r>
+        <w:t xml:space="preserve"> élimination</w:t>
+      </w:r>
+    </w:p>
+    <w:p>
+      <w:r>
+        <w:t xml:space="preserve">Le score </w:t>
+      </w:r>
+      <w:proofErr w:type="gramStart"/>
+      <w:r>
+        <w:t>n'as</w:t>
+      </w:r>
+      <w:proofErr w:type="gramEnd"/>
+      <w:r>
+        <w:t xml:space="preserve"> pas de point max, il peut monter autant que le joueur élimine des ennemis.</w:t>
+      </w:r>
+      <w:r>
+        <w:br/>
+        <w:t xml:space="preserve">Quand une nouvelle partie se lance alors le score se met </w:t>
+      </w:r>
+      <w:proofErr w:type="spellStart"/>
+      <w:r>
+        <w:t>a</w:t>
+      </w:r>
+      <w:proofErr w:type="spellEnd"/>
+      <w:r>
+        <w:t xml:space="preserve"> </w:t>
+      </w:r>
+      <w:proofErr w:type="spellStart"/>
+      <w:r>
+        <w:t>zero</w:t>
+      </w:r>
+      <w:proofErr w:type="spellEnd"/>
+      <w:r>
+        <w:t>.</w:t>
+      </w:r>
+    </w:p>
+    <w:p/>
+    <w:p>
+      <w:r>
+        <w:t>En tant que joueur je veux gagner afin de terminer la partie.</w:t>
+      </w:r>
+    </w:p>
+    <w:p>
+      <w:r>
+        <w:t>La partie est gagner quand le joueur élimine tous les ennemis.</w:t>
+      </w:r>
+      <w:r>
+        <w:br/>
+        <w:t xml:space="preserve">Quand un joueur gagne la partie, une image avec un message de victoire est </w:t>
+      </w:r>
+      <w:proofErr w:type="gramStart"/>
+      <w:r>
+        <w:t>affiché</w:t>
+      </w:r>
+      <w:proofErr w:type="gramEnd"/>
+      <w:r>
+        <w:t>.</w:t>
+      </w:r>
+      <w:r>
+        <w:br/>
+        <w:t xml:space="preserve">Le score total </w:t>
+      </w:r>
+      <w:proofErr w:type="gramStart"/>
+      <w:r>
+        <w:t>est</w:t>
+      </w:r>
+      <w:proofErr w:type="gramEnd"/>
+      <w:r>
+        <w:t xml:space="preserve"> affiché dessous le message de victoire.</w:t>
+      </w:r>
+      <w:r>
+        <w:br/>
+        <w:t xml:space="preserve">L'option rejouer ou de quitter est </w:t>
+      </w:r>
+      <w:proofErr w:type="spellStart"/>
+      <w:r>
+        <w:t>dispnible</w:t>
+      </w:r>
+      <w:proofErr w:type="spellEnd"/>
+      <w:r>
+        <w:t xml:space="preserve"> sur l'écran de fin.</w:t>
+      </w:r>
+    </w:p>
+    <w:p/>
+    <w:p>
+      <w:r>
+        <w:t>En tant que joueur je veux perdre afin de pouvoir terminer le jeu.</w:t>
+      </w:r>
+    </w:p>
+    <w:p>
+      <w:r>
+        <w:t xml:space="preserve">La partie se termine quand le joueur </w:t>
+      </w:r>
+      <w:proofErr w:type="gramStart"/>
+      <w:r>
+        <w:t>n'as</w:t>
+      </w:r>
+      <w:proofErr w:type="gramEnd"/>
+      <w:r>
+        <w:t xml:space="preserve"> plus de PV.</w:t>
+      </w:r>
+      <w:r>
+        <w:br/>
+        <w:t>Un écran de fin s'affiche avec l'option de rejouer ou de quitter.</w:t>
+      </w:r>
+      <w:r>
+        <w:br/>
+        <w:t>Le score total est affiché sur l'écran de fin.</w:t>
+      </w:r>
+    </w:p>
+    <w:p/>
+    <w:p/>
     <w:p>
       <w:pPr>
         <w:pStyle w:val="Titre1"/>
@@ -1754,7 +2236,6 @@
         <w:rPr>
           <w:lang w:val="en-US"/>
         </w:rPr>
-        <w:lastRenderedPageBreak/>
         <w:t>Semaine</w:t>
       </w:r>
       <w:proofErr w:type="spellEnd"/>
@@ -1821,6 +2302,7 @@
         <w:rPr>
           <w:lang w:val="en-US"/>
         </w:rPr>
+        <w:lastRenderedPageBreak/>
         <w:t>Semaine</w:t>
       </w:r>
       <w:proofErr w:type="spellEnd"/>
@@ -1864,6 +2346,155 @@
 <file path=word/numbering.xml><?xml version="1.0" encoding="utf-8"?>
 <w:numbering xmlns:wpc="http://schemas.microsoft.com/office/word/2010/wordprocessingCanvas" xmlns:cx="http://schemas.microsoft.com/office/drawing/2014/chartex" xmlns:cx1="http://schemas.microsoft.com/office/drawing/2015/9/8/chartex" xmlns:cx2="http://schemas.microsoft.com/office/drawing/2015/10/21/chartex" xmlns:cx3="http://schemas.microsoft.com/office/drawing/2016/5/9/chartex" xmlns:cx4="http://schemas.microsoft.com/office/drawing/2016/5/10/chartex" xmlns:cx5="http://schemas.microsoft.com/office/drawing/2016/5/11/chartex" xmlns:cx6="http://schemas.microsoft.com/office/drawing/2016/5/12/chartex" xmlns:cx7="http://schemas.microsoft.com/office/drawing/2016/5/13/chartex" xmlns:cx8="http://schemas.microsoft.com/office/drawing/2016/5/14/chartex" xmlns:mc="http://schemas.openxmlformats.org/markup-compatibility/2006" xmlns:aink="http://schemas.microsoft.com/office/drawing/2016/ink" xmlns:am3d="http://schemas.microsoft.com/office/drawing/2017/model3d" xmlns:o="urn:schemas-microsoft-com:office:office" xmlns:oel="http://schemas.microsoft.com/office/2019/extlst" xmlns:r="http://schemas.openxmlformats.org/officeDocument/2006/relationships" xmlns:m="http://schemas.openxmlformats.org/officeDocument/2006/math" xmlns:v="urn:schemas-microsoft-com:vml" xmlns:wp14="http://schemas.microsoft.com/office/word/2010/wordprocessingDrawing" xmlns:wp="http://schemas.openxmlformats.org/drawingml/2006/wordprocessingDrawing" xmlns:w10="urn:schemas-microsoft-com:office:word" xmlns:w="http://schemas.openxmlformats.org/wordprocessingml/2006/main" xmlns:w14="http://schemas.microsoft.com/office/word/2010/wordml" xmlns:w15="http://schemas.microsoft.com/office/word/2012/wordml" xmlns:w16cex="http://schemas.microsoft.com/office/word/2018/wordml/cex" xmlns:w16cid="http://schemas.microsoft.com/office/word/2016/wordml/cid" xmlns:w16="http://schemas.microsoft.com/office/word/2018/wordml" xmlns:w16du="http://schemas.microsoft.com/office/word/2023/wordml/word16du" xmlns:w16sdtdh="http://schemas.microsoft.com/office/word/2020/wordml/sdtdatahash" xmlns:w16sdtfl="http://schemas.microsoft.com/office/word/2024/wordml/sdtformatlock" xmlns:w16se="http://schemas.microsoft.com/office/word/2015/wordml/symex" xmlns:wpg="http://schemas.microsoft.com/office/word/2010/wordprocessingGroup" xmlns:wpi="http://schemas.microsoft.com/office/word/2010/wordprocessingInk" xmlns:wne="http://schemas.microsoft.com/office/word/2006/wordml" xmlns:wps="http://schemas.microsoft.com/office/word/2010/wordprocessingShape" mc:Ignorable="w14 w15 w16se w16cid w16 w16cex w16sdtdh w16sdtfl w16du wp14">
   <w:abstractNum w:abstractNumId="0" w15:restartNumberingAfterBreak="0">
+    <w:nsid w:val="1A5E3388"/>
+    <w:multiLevelType w:val="multilevel"/>
+    <w:tmpl w:val="3C7CB58C"/>
+    <w:lvl w:ilvl="0">
+      <w:start w:val="1"/>
+      <w:numFmt w:val="bullet"/>
+      <w:lvlText w:val=""/>
+      <w:lvlJc w:val="left"/>
+      <w:pPr>
+        <w:tabs>
+          <w:tab w:val="num" w:pos="720"/>
+        </w:tabs>
+        <w:ind w:left="720" w:hanging="360"/>
+      </w:pPr>
+      <w:rPr>
+        <w:rFonts w:ascii="Symbol" w:hAnsi="Symbol" w:hint="default"/>
+        <w:sz w:val="20"/>
+      </w:rPr>
+    </w:lvl>
+    <w:lvl w:ilvl="1" w:tentative="1">
+      <w:start w:val="1"/>
+      <w:numFmt w:val="bullet"/>
+      <w:lvlText w:val="o"/>
+      <w:lvlJc w:val="left"/>
+      <w:pPr>
+        <w:tabs>
+          <w:tab w:val="num" w:pos="1440"/>
+        </w:tabs>
+        <w:ind w:left="1440" w:hanging="360"/>
+      </w:pPr>
+      <w:rPr>
+        <w:rFonts w:ascii="Courier New" w:hAnsi="Courier New" w:hint="default"/>
+        <w:sz w:val="20"/>
+      </w:rPr>
+    </w:lvl>
+    <w:lvl w:ilvl="2" w:tentative="1">
+      <w:start w:val="1"/>
+      <w:numFmt w:val="bullet"/>
+      <w:lvlText w:val=""/>
+      <w:lvlJc w:val="left"/>
+      <w:pPr>
+        <w:tabs>
+          <w:tab w:val="num" w:pos="2160"/>
+        </w:tabs>
+        <w:ind w:left="2160" w:hanging="360"/>
+      </w:pPr>
+      <w:rPr>
+        <w:rFonts w:ascii="Wingdings" w:hAnsi="Wingdings" w:hint="default"/>
+        <w:sz w:val="20"/>
+      </w:rPr>
+    </w:lvl>
+    <w:lvl w:ilvl="3" w:tentative="1">
+      <w:start w:val="1"/>
+      <w:numFmt w:val="bullet"/>
+      <w:lvlText w:val=""/>
+      <w:lvlJc w:val="left"/>
+      <w:pPr>
+        <w:tabs>
+          <w:tab w:val="num" w:pos="2880"/>
+        </w:tabs>
+        <w:ind w:left="2880" w:hanging="360"/>
+      </w:pPr>
+      <w:rPr>
+        <w:rFonts w:ascii="Wingdings" w:hAnsi="Wingdings" w:hint="default"/>
+        <w:sz w:val="20"/>
+      </w:rPr>
+    </w:lvl>
+    <w:lvl w:ilvl="4" w:tentative="1">
+      <w:start w:val="1"/>
+      <w:numFmt w:val="bullet"/>
+      <w:lvlText w:val=""/>
+      <w:lvlJc w:val="left"/>
+      <w:pPr>
+        <w:tabs>
+          <w:tab w:val="num" w:pos="3600"/>
+        </w:tabs>
+        <w:ind w:left="3600" w:hanging="360"/>
+      </w:pPr>
+      <w:rPr>
+        <w:rFonts w:ascii="Wingdings" w:hAnsi="Wingdings" w:hint="default"/>
+        <w:sz w:val="20"/>
+      </w:rPr>
+    </w:lvl>
+    <w:lvl w:ilvl="5" w:tentative="1">
+      <w:start w:val="1"/>
+      <w:numFmt w:val="bullet"/>
+      <w:lvlText w:val=""/>
+      <w:lvlJc w:val="left"/>
+      <w:pPr>
+        <w:tabs>
+          <w:tab w:val="num" w:pos="4320"/>
+        </w:tabs>
+        <w:ind w:left="4320" w:hanging="360"/>
+      </w:pPr>
+      <w:rPr>
+        <w:rFonts w:ascii="Wingdings" w:hAnsi="Wingdings" w:hint="default"/>
+        <w:sz w:val="20"/>
+      </w:rPr>
+    </w:lvl>
+    <w:lvl w:ilvl="6" w:tentative="1">
+      <w:start w:val="1"/>
+      <w:numFmt w:val="bullet"/>
+      <w:lvlText w:val=""/>
+      <w:lvlJc w:val="left"/>
+      <w:pPr>
+        <w:tabs>
+          <w:tab w:val="num" w:pos="5040"/>
+        </w:tabs>
+        <w:ind w:left="5040" w:hanging="360"/>
+      </w:pPr>
+      <w:rPr>
+        <w:rFonts w:ascii="Wingdings" w:hAnsi="Wingdings" w:hint="default"/>
+        <w:sz w:val="20"/>
+      </w:rPr>
+    </w:lvl>
+    <w:lvl w:ilvl="7" w:tentative="1">
+      <w:start w:val="1"/>
+      <w:numFmt w:val="bullet"/>
+      <w:lvlText w:val=""/>
+      <w:lvlJc w:val="left"/>
+      <w:pPr>
+        <w:tabs>
+          <w:tab w:val="num" w:pos="5760"/>
+        </w:tabs>
+        <w:ind w:left="5760" w:hanging="360"/>
+      </w:pPr>
+      <w:rPr>
+        <w:rFonts w:ascii="Wingdings" w:hAnsi="Wingdings" w:hint="default"/>
+        <w:sz w:val="20"/>
+      </w:rPr>
+    </w:lvl>
+    <w:lvl w:ilvl="8" w:tentative="1">
+      <w:start w:val="1"/>
+      <w:numFmt w:val="bullet"/>
+      <w:lvlText w:val=""/>
+      <w:lvlJc w:val="left"/>
+      <w:pPr>
+        <w:tabs>
+          <w:tab w:val="num" w:pos="6480"/>
+        </w:tabs>
+        <w:ind w:left="6480" w:hanging="360"/>
+      </w:pPr>
+      <w:rPr>
+        <w:rFonts w:ascii="Wingdings" w:hAnsi="Wingdings" w:hint="default"/>
+        <w:sz w:val="20"/>
+      </w:rPr>
+    </w:lvl>
+  </w:abstractNum>
+  <w:abstractNum w:abstractNumId="1" w15:restartNumberingAfterBreak="0">
     <w:nsid w:val="1CA21DAF"/>
     <w:multiLevelType w:val="hybridMultilevel"/>
     <w:tmpl w:val="0A908768"/>
@@ -1976,7 +2607,454 @@
       </w:rPr>
     </w:lvl>
   </w:abstractNum>
-  <w:abstractNum w:abstractNumId="1" w15:restartNumberingAfterBreak="0">
+  <w:abstractNum w:abstractNumId="2" w15:restartNumberingAfterBreak="0">
+    <w:nsid w:val="27046C6B"/>
+    <w:multiLevelType w:val="multilevel"/>
+    <w:tmpl w:val="0620741A"/>
+    <w:lvl w:ilvl="0">
+      <w:start w:val="1"/>
+      <w:numFmt w:val="bullet"/>
+      <w:lvlText w:val=""/>
+      <w:lvlJc w:val="left"/>
+      <w:pPr>
+        <w:tabs>
+          <w:tab w:val="num" w:pos="720"/>
+        </w:tabs>
+        <w:ind w:left="720" w:hanging="360"/>
+      </w:pPr>
+      <w:rPr>
+        <w:rFonts w:ascii="Symbol" w:hAnsi="Symbol" w:hint="default"/>
+        <w:sz w:val="20"/>
+      </w:rPr>
+    </w:lvl>
+    <w:lvl w:ilvl="1" w:tentative="1">
+      <w:start w:val="1"/>
+      <w:numFmt w:val="bullet"/>
+      <w:lvlText w:val="o"/>
+      <w:lvlJc w:val="left"/>
+      <w:pPr>
+        <w:tabs>
+          <w:tab w:val="num" w:pos="1440"/>
+        </w:tabs>
+        <w:ind w:left="1440" w:hanging="360"/>
+      </w:pPr>
+      <w:rPr>
+        <w:rFonts w:ascii="Courier New" w:hAnsi="Courier New" w:hint="default"/>
+        <w:sz w:val="20"/>
+      </w:rPr>
+    </w:lvl>
+    <w:lvl w:ilvl="2" w:tentative="1">
+      <w:start w:val="1"/>
+      <w:numFmt w:val="bullet"/>
+      <w:lvlText w:val=""/>
+      <w:lvlJc w:val="left"/>
+      <w:pPr>
+        <w:tabs>
+          <w:tab w:val="num" w:pos="2160"/>
+        </w:tabs>
+        <w:ind w:left="2160" w:hanging="360"/>
+      </w:pPr>
+      <w:rPr>
+        <w:rFonts w:ascii="Wingdings" w:hAnsi="Wingdings" w:hint="default"/>
+        <w:sz w:val="20"/>
+      </w:rPr>
+    </w:lvl>
+    <w:lvl w:ilvl="3" w:tentative="1">
+      <w:start w:val="1"/>
+      <w:numFmt w:val="bullet"/>
+      <w:lvlText w:val=""/>
+      <w:lvlJc w:val="left"/>
+      <w:pPr>
+        <w:tabs>
+          <w:tab w:val="num" w:pos="2880"/>
+        </w:tabs>
+        <w:ind w:left="2880" w:hanging="360"/>
+      </w:pPr>
+      <w:rPr>
+        <w:rFonts w:ascii="Wingdings" w:hAnsi="Wingdings" w:hint="default"/>
+        <w:sz w:val="20"/>
+      </w:rPr>
+    </w:lvl>
+    <w:lvl w:ilvl="4" w:tentative="1">
+      <w:start w:val="1"/>
+      <w:numFmt w:val="bullet"/>
+      <w:lvlText w:val=""/>
+      <w:lvlJc w:val="left"/>
+      <w:pPr>
+        <w:tabs>
+          <w:tab w:val="num" w:pos="3600"/>
+        </w:tabs>
+        <w:ind w:left="3600" w:hanging="360"/>
+      </w:pPr>
+      <w:rPr>
+        <w:rFonts w:ascii="Wingdings" w:hAnsi="Wingdings" w:hint="default"/>
+        <w:sz w:val="20"/>
+      </w:rPr>
+    </w:lvl>
+    <w:lvl w:ilvl="5" w:tentative="1">
+      <w:start w:val="1"/>
+      <w:numFmt w:val="bullet"/>
+      <w:lvlText w:val=""/>
+      <w:lvlJc w:val="left"/>
+      <w:pPr>
+        <w:tabs>
+          <w:tab w:val="num" w:pos="4320"/>
+        </w:tabs>
+        <w:ind w:left="4320" w:hanging="360"/>
+      </w:pPr>
+      <w:rPr>
+        <w:rFonts w:ascii="Wingdings" w:hAnsi="Wingdings" w:hint="default"/>
+        <w:sz w:val="20"/>
+      </w:rPr>
+    </w:lvl>
+    <w:lvl w:ilvl="6" w:tentative="1">
+      <w:start w:val="1"/>
+      <w:numFmt w:val="bullet"/>
+      <w:lvlText w:val=""/>
+      <w:lvlJc w:val="left"/>
+      <w:pPr>
+        <w:tabs>
+          <w:tab w:val="num" w:pos="5040"/>
+        </w:tabs>
+        <w:ind w:left="5040" w:hanging="360"/>
+      </w:pPr>
+      <w:rPr>
+        <w:rFonts w:ascii="Wingdings" w:hAnsi="Wingdings" w:hint="default"/>
+        <w:sz w:val="20"/>
+      </w:rPr>
+    </w:lvl>
+    <w:lvl w:ilvl="7" w:tentative="1">
+      <w:start w:val="1"/>
+      <w:numFmt w:val="bullet"/>
+      <w:lvlText w:val=""/>
+      <w:lvlJc w:val="left"/>
+      <w:pPr>
+        <w:tabs>
+          <w:tab w:val="num" w:pos="5760"/>
+        </w:tabs>
+        <w:ind w:left="5760" w:hanging="360"/>
+      </w:pPr>
+      <w:rPr>
+        <w:rFonts w:ascii="Wingdings" w:hAnsi="Wingdings" w:hint="default"/>
+        <w:sz w:val="20"/>
+      </w:rPr>
+    </w:lvl>
+    <w:lvl w:ilvl="8" w:tentative="1">
+      <w:start w:val="1"/>
+      <w:numFmt w:val="bullet"/>
+      <w:lvlText w:val=""/>
+      <w:lvlJc w:val="left"/>
+      <w:pPr>
+        <w:tabs>
+          <w:tab w:val="num" w:pos="6480"/>
+        </w:tabs>
+        <w:ind w:left="6480" w:hanging="360"/>
+      </w:pPr>
+      <w:rPr>
+        <w:rFonts w:ascii="Wingdings" w:hAnsi="Wingdings" w:hint="default"/>
+        <w:sz w:val="20"/>
+      </w:rPr>
+    </w:lvl>
+  </w:abstractNum>
+  <w:abstractNum w:abstractNumId="3" w15:restartNumberingAfterBreak="0">
+    <w:nsid w:val="3E197579"/>
+    <w:multiLevelType w:val="multilevel"/>
+    <w:tmpl w:val="007CF312"/>
+    <w:lvl w:ilvl="0">
+      <w:start w:val="1"/>
+      <w:numFmt w:val="bullet"/>
+      <w:lvlText w:val=""/>
+      <w:lvlJc w:val="left"/>
+      <w:pPr>
+        <w:tabs>
+          <w:tab w:val="num" w:pos="720"/>
+        </w:tabs>
+        <w:ind w:left="720" w:hanging="360"/>
+      </w:pPr>
+      <w:rPr>
+        <w:rFonts w:ascii="Symbol" w:hAnsi="Symbol" w:hint="default"/>
+        <w:sz w:val="20"/>
+      </w:rPr>
+    </w:lvl>
+    <w:lvl w:ilvl="1" w:tentative="1">
+      <w:start w:val="1"/>
+      <w:numFmt w:val="bullet"/>
+      <w:lvlText w:val="o"/>
+      <w:lvlJc w:val="left"/>
+      <w:pPr>
+        <w:tabs>
+          <w:tab w:val="num" w:pos="1440"/>
+        </w:tabs>
+        <w:ind w:left="1440" w:hanging="360"/>
+      </w:pPr>
+      <w:rPr>
+        <w:rFonts w:ascii="Courier New" w:hAnsi="Courier New" w:hint="default"/>
+        <w:sz w:val="20"/>
+      </w:rPr>
+    </w:lvl>
+    <w:lvl w:ilvl="2" w:tentative="1">
+      <w:start w:val="1"/>
+      <w:numFmt w:val="bullet"/>
+      <w:lvlText w:val=""/>
+      <w:lvlJc w:val="left"/>
+      <w:pPr>
+        <w:tabs>
+          <w:tab w:val="num" w:pos="2160"/>
+        </w:tabs>
+        <w:ind w:left="2160" w:hanging="360"/>
+      </w:pPr>
+      <w:rPr>
+        <w:rFonts w:ascii="Wingdings" w:hAnsi="Wingdings" w:hint="default"/>
+        <w:sz w:val="20"/>
+      </w:rPr>
+    </w:lvl>
+    <w:lvl w:ilvl="3" w:tentative="1">
+      <w:start w:val="1"/>
+      <w:numFmt w:val="bullet"/>
+      <w:lvlText w:val=""/>
+      <w:lvlJc w:val="left"/>
+      <w:pPr>
+        <w:tabs>
+          <w:tab w:val="num" w:pos="2880"/>
+        </w:tabs>
+        <w:ind w:left="2880" w:hanging="360"/>
+      </w:pPr>
+      <w:rPr>
+        <w:rFonts w:ascii="Wingdings" w:hAnsi="Wingdings" w:hint="default"/>
+        <w:sz w:val="20"/>
+      </w:rPr>
+    </w:lvl>
+    <w:lvl w:ilvl="4" w:tentative="1">
+      <w:start w:val="1"/>
+      <w:numFmt w:val="bullet"/>
+      <w:lvlText w:val=""/>
+      <w:lvlJc w:val="left"/>
+      <w:pPr>
+        <w:tabs>
+          <w:tab w:val="num" w:pos="3600"/>
+        </w:tabs>
+        <w:ind w:left="3600" w:hanging="360"/>
+      </w:pPr>
+      <w:rPr>
+        <w:rFonts w:ascii="Wingdings" w:hAnsi="Wingdings" w:hint="default"/>
+        <w:sz w:val="20"/>
+      </w:rPr>
+    </w:lvl>
+    <w:lvl w:ilvl="5" w:tentative="1">
+      <w:start w:val="1"/>
+      <w:numFmt w:val="bullet"/>
+      <w:lvlText w:val=""/>
+      <w:lvlJc w:val="left"/>
+      <w:pPr>
+        <w:tabs>
+          <w:tab w:val="num" w:pos="4320"/>
+        </w:tabs>
+        <w:ind w:left="4320" w:hanging="360"/>
+      </w:pPr>
+      <w:rPr>
+        <w:rFonts w:ascii="Wingdings" w:hAnsi="Wingdings" w:hint="default"/>
+        <w:sz w:val="20"/>
+      </w:rPr>
+    </w:lvl>
+    <w:lvl w:ilvl="6" w:tentative="1">
+      <w:start w:val="1"/>
+      <w:numFmt w:val="bullet"/>
+      <w:lvlText w:val=""/>
+      <w:lvlJc w:val="left"/>
+      <w:pPr>
+        <w:tabs>
+          <w:tab w:val="num" w:pos="5040"/>
+        </w:tabs>
+        <w:ind w:left="5040" w:hanging="360"/>
+      </w:pPr>
+      <w:rPr>
+        <w:rFonts w:ascii="Wingdings" w:hAnsi="Wingdings" w:hint="default"/>
+        <w:sz w:val="20"/>
+      </w:rPr>
+    </w:lvl>
+    <w:lvl w:ilvl="7" w:tentative="1">
+      <w:start w:val="1"/>
+      <w:numFmt w:val="bullet"/>
+      <w:lvlText w:val=""/>
+      <w:lvlJc w:val="left"/>
+      <w:pPr>
+        <w:tabs>
+          <w:tab w:val="num" w:pos="5760"/>
+        </w:tabs>
+        <w:ind w:left="5760" w:hanging="360"/>
+      </w:pPr>
+      <w:rPr>
+        <w:rFonts w:ascii="Wingdings" w:hAnsi="Wingdings" w:hint="default"/>
+        <w:sz w:val="20"/>
+      </w:rPr>
+    </w:lvl>
+    <w:lvl w:ilvl="8" w:tentative="1">
+      <w:start w:val="1"/>
+      <w:numFmt w:val="bullet"/>
+      <w:lvlText w:val=""/>
+      <w:lvlJc w:val="left"/>
+      <w:pPr>
+        <w:tabs>
+          <w:tab w:val="num" w:pos="6480"/>
+        </w:tabs>
+        <w:ind w:left="6480" w:hanging="360"/>
+      </w:pPr>
+      <w:rPr>
+        <w:rFonts w:ascii="Wingdings" w:hAnsi="Wingdings" w:hint="default"/>
+        <w:sz w:val="20"/>
+      </w:rPr>
+    </w:lvl>
+  </w:abstractNum>
+  <w:abstractNum w:abstractNumId="4" w15:restartNumberingAfterBreak="0">
+    <w:nsid w:val="51ED4751"/>
+    <w:multiLevelType w:val="multilevel"/>
+    <w:tmpl w:val="7966C356"/>
+    <w:lvl w:ilvl="0">
+      <w:start w:val="1"/>
+      <w:numFmt w:val="bullet"/>
+      <w:lvlText w:val=""/>
+      <w:lvlJc w:val="left"/>
+      <w:pPr>
+        <w:tabs>
+          <w:tab w:val="num" w:pos="720"/>
+        </w:tabs>
+        <w:ind w:left="720" w:hanging="360"/>
+      </w:pPr>
+      <w:rPr>
+        <w:rFonts w:ascii="Symbol" w:hAnsi="Symbol" w:hint="default"/>
+        <w:sz w:val="20"/>
+      </w:rPr>
+    </w:lvl>
+    <w:lvl w:ilvl="1" w:tentative="1">
+      <w:start w:val="1"/>
+      <w:numFmt w:val="bullet"/>
+      <w:lvlText w:val="o"/>
+      <w:lvlJc w:val="left"/>
+      <w:pPr>
+        <w:tabs>
+          <w:tab w:val="num" w:pos="1440"/>
+        </w:tabs>
+        <w:ind w:left="1440" w:hanging="360"/>
+      </w:pPr>
+      <w:rPr>
+        <w:rFonts w:ascii="Courier New" w:hAnsi="Courier New" w:hint="default"/>
+        <w:sz w:val="20"/>
+      </w:rPr>
+    </w:lvl>
+    <w:lvl w:ilvl="2" w:tentative="1">
+      <w:start w:val="1"/>
+      <w:numFmt w:val="bullet"/>
+      <w:lvlText w:val=""/>
+      <w:lvlJc w:val="left"/>
+      <w:pPr>
+        <w:tabs>
+          <w:tab w:val="num" w:pos="2160"/>
+        </w:tabs>
+        <w:ind w:left="2160" w:hanging="360"/>
+      </w:pPr>
+      <w:rPr>
+        <w:rFonts w:ascii="Wingdings" w:hAnsi="Wingdings" w:hint="default"/>
+        <w:sz w:val="20"/>
+      </w:rPr>
+    </w:lvl>
+    <w:lvl w:ilvl="3" w:tentative="1">
+      <w:start w:val="1"/>
+      <w:numFmt w:val="bullet"/>
+      <w:lvlText w:val=""/>
+      <w:lvlJc w:val="left"/>
+      <w:pPr>
+        <w:tabs>
+          <w:tab w:val="num" w:pos="2880"/>
+        </w:tabs>
+        <w:ind w:left="2880" w:hanging="360"/>
+      </w:pPr>
+      <w:rPr>
+        <w:rFonts w:ascii="Wingdings" w:hAnsi="Wingdings" w:hint="default"/>
+        <w:sz w:val="20"/>
+      </w:rPr>
+    </w:lvl>
+    <w:lvl w:ilvl="4" w:tentative="1">
+      <w:start w:val="1"/>
+      <w:numFmt w:val="bullet"/>
+      <w:lvlText w:val=""/>
+      <w:lvlJc w:val="left"/>
+      <w:pPr>
+        <w:tabs>
+          <w:tab w:val="num" w:pos="3600"/>
+        </w:tabs>
+        <w:ind w:left="3600" w:hanging="360"/>
+      </w:pPr>
+      <w:rPr>
+        <w:rFonts w:ascii="Wingdings" w:hAnsi="Wingdings" w:hint="default"/>
+        <w:sz w:val="20"/>
+      </w:rPr>
+    </w:lvl>
+    <w:lvl w:ilvl="5" w:tentative="1">
+      <w:start w:val="1"/>
+      <w:numFmt w:val="bullet"/>
+      <w:lvlText w:val=""/>
+      <w:lvlJc w:val="left"/>
+      <w:pPr>
+        <w:tabs>
+          <w:tab w:val="num" w:pos="4320"/>
+        </w:tabs>
+        <w:ind w:left="4320" w:hanging="360"/>
+      </w:pPr>
+      <w:rPr>
+        <w:rFonts w:ascii="Wingdings" w:hAnsi="Wingdings" w:hint="default"/>
+        <w:sz w:val="20"/>
+      </w:rPr>
+    </w:lvl>
+    <w:lvl w:ilvl="6" w:tentative="1">
+      <w:start w:val="1"/>
+      <w:numFmt w:val="bullet"/>
+      <w:lvlText w:val=""/>
+      <w:lvlJc w:val="left"/>
+      <w:pPr>
+        <w:tabs>
+          <w:tab w:val="num" w:pos="5040"/>
+        </w:tabs>
+        <w:ind w:left="5040" w:hanging="360"/>
+      </w:pPr>
+      <w:rPr>
+        <w:rFonts w:ascii="Wingdings" w:hAnsi="Wingdings" w:hint="default"/>
+        <w:sz w:val="20"/>
+      </w:rPr>
+    </w:lvl>
+    <w:lvl w:ilvl="7" w:tentative="1">
+      <w:start w:val="1"/>
+      <w:numFmt w:val="bullet"/>
+      <w:lvlText w:val=""/>
+      <w:lvlJc w:val="left"/>
+      <w:pPr>
+        <w:tabs>
+          <w:tab w:val="num" w:pos="5760"/>
+        </w:tabs>
+        <w:ind w:left="5760" w:hanging="360"/>
+      </w:pPr>
+      <w:rPr>
+        <w:rFonts w:ascii="Wingdings" w:hAnsi="Wingdings" w:hint="default"/>
+        <w:sz w:val="20"/>
+      </w:rPr>
+    </w:lvl>
+    <w:lvl w:ilvl="8" w:tentative="1">
+      <w:start w:val="1"/>
+      <w:numFmt w:val="bullet"/>
+      <w:lvlText w:val=""/>
+      <w:lvlJc w:val="left"/>
+      <w:pPr>
+        <w:tabs>
+          <w:tab w:val="num" w:pos="6480"/>
+        </w:tabs>
+        <w:ind w:left="6480" w:hanging="360"/>
+      </w:pPr>
+      <w:rPr>
+        <w:rFonts w:ascii="Wingdings" w:hAnsi="Wingdings" w:hint="default"/>
+        <w:sz w:val="20"/>
+      </w:rPr>
+    </w:lvl>
+  </w:abstractNum>
+  <w:abstractNum w:abstractNumId="5" w15:restartNumberingAfterBreak="0">
     <w:nsid w:val="52B70BAA"/>
     <w:multiLevelType w:val="hybridMultilevel"/>
     <w:tmpl w:val="2D1A8536"/>
@@ -2089,11 +3167,175 @@
       </w:rPr>
     </w:lvl>
   </w:abstractNum>
+  <w:abstractNum w:abstractNumId="6" w15:restartNumberingAfterBreak="0">
+    <w:nsid w:val="64820E05"/>
+    <w:multiLevelType w:val="multilevel"/>
+    <w:tmpl w:val="08866358"/>
+    <w:lvl w:ilvl="0">
+      <w:start w:val="1"/>
+      <w:numFmt w:val="bullet"/>
+      <w:lvlText w:val=""/>
+      <w:lvlJc w:val="left"/>
+      <w:pPr>
+        <w:tabs>
+          <w:tab w:val="num" w:pos="720"/>
+        </w:tabs>
+        <w:ind w:left="720" w:hanging="360"/>
+      </w:pPr>
+      <w:rPr>
+        <w:rFonts w:ascii="Symbol" w:hAnsi="Symbol" w:hint="default"/>
+        <w:sz w:val="20"/>
+      </w:rPr>
+    </w:lvl>
+    <w:lvl w:ilvl="1" w:tentative="1">
+      <w:start w:val="1"/>
+      <w:numFmt w:val="bullet"/>
+      <w:lvlText w:val="o"/>
+      <w:lvlJc w:val="left"/>
+      <w:pPr>
+        <w:tabs>
+          <w:tab w:val="num" w:pos="1440"/>
+        </w:tabs>
+        <w:ind w:left="1440" w:hanging="360"/>
+      </w:pPr>
+      <w:rPr>
+        <w:rFonts w:ascii="Courier New" w:hAnsi="Courier New" w:hint="default"/>
+        <w:sz w:val="20"/>
+      </w:rPr>
+    </w:lvl>
+    <w:lvl w:ilvl="2" w:tentative="1">
+      <w:start w:val="1"/>
+      <w:numFmt w:val="bullet"/>
+      <w:lvlText w:val=""/>
+      <w:lvlJc w:val="left"/>
+      <w:pPr>
+        <w:tabs>
+          <w:tab w:val="num" w:pos="2160"/>
+        </w:tabs>
+        <w:ind w:left="2160" w:hanging="360"/>
+      </w:pPr>
+      <w:rPr>
+        <w:rFonts w:ascii="Wingdings" w:hAnsi="Wingdings" w:hint="default"/>
+        <w:sz w:val="20"/>
+      </w:rPr>
+    </w:lvl>
+    <w:lvl w:ilvl="3" w:tentative="1">
+      <w:start w:val="1"/>
+      <w:numFmt w:val="bullet"/>
+      <w:lvlText w:val=""/>
+      <w:lvlJc w:val="left"/>
+      <w:pPr>
+        <w:tabs>
+          <w:tab w:val="num" w:pos="2880"/>
+        </w:tabs>
+        <w:ind w:left="2880" w:hanging="360"/>
+      </w:pPr>
+      <w:rPr>
+        <w:rFonts w:ascii="Wingdings" w:hAnsi="Wingdings" w:hint="default"/>
+        <w:sz w:val="20"/>
+      </w:rPr>
+    </w:lvl>
+    <w:lvl w:ilvl="4" w:tentative="1">
+      <w:start w:val="1"/>
+      <w:numFmt w:val="bullet"/>
+      <w:lvlText w:val=""/>
+      <w:lvlJc w:val="left"/>
+      <w:pPr>
+        <w:tabs>
+          <w:tab w:val="num" w:pos="3600"/>
+        </w:tabs>
+        <w:ind w:left="3600" w:hanging="360"/>
+      </w:pPr>
+      <w:rPr>
+        <w:rFonts w:ascii="Wingdings" w:hAnsi="Wingdings" w:hint="default"/>
+        <w:sz w:val="20"/>
+      </w:rPr>
+    </w:lvl>
+    <w:lvl w:ilvl="5" w:tentative="1">
+      <w:start w:val="1"/>
+      <w:numFmt w:val="bullet"/>
+      <w:lvlText w:val=""/>
+      <w:lvlJc w:val="left"/>
+      <w:pPr>
+        <w:tabs>
+          <w:tab w:val="num" w:pos="4320"/>
+        </w:tabs>
+        <w:ind w:left="4320" w:hanging="360"/>
+      </w:pPr>
+      <w:rPr>
+        <w:rFonts w:ascii="Wingdings" w:hAnsi="Wingdings" w:hint="default"/>
+        <w:sz w:val="20"/>
+      </w:rPr>
+    </w:lvl>
+    <w:lvl w:ilvl="6" w:tentative="1">
+      <w:start w:val="1"/>
+      <w:numFmt w:val="bullet"/>
+      <w:lvlText w:val=""/>
+      <w:lvlJc w:val="left"/>
+      <w:pPr>
+        <w:tabs>
+          <w:tab w:val="num" w:pos="5040"/>
+        </w:tabs>
+        <w:ind w:left="5040" w:hanging="360"/>
+      </w:pPr>
+      <w:rPr>
+        <w:rFonts w:ascii="Wingdings" w:hAnsi="Wingdings" w:hint="default"/>
+        <w:sz w:val="20"/>
+      </w:rPr>
+    </w:lvl>
+    <w:lvl w:ilvl="7" w:tentative="1">
+      <w:start w:val="1"/>
+      <w:numFmt w:val="bullet"/>
+      <w:lvlText w:val=""/>
+      <w:lvlJc w:val="left"/>
+      <w:pPr>
+        <w:tabs>
+          <w:tab w:val="num" w:pos="5760"/>
+        </w:tabs>
+        <w:ind w:left="5760" w:hanging="360"/>
+      </w:pPr>
+      <w:rPr>
+        <w:rFonts w:ascii="Wingdings" w:hAnsi="Wingdings" w:hint="default"/>
+        <w:sz w:val="20"/>
+      </w:rPr>
+    </w:lvl>
+    <w:lvl w:ilvl="8" w:tentative="1">
+      <w:start w:val="1"/>
+      <w:numFmt w:val="bullet"/>
+      <w:lvlText w:val=""/>
+      <w:lvlJc w:val="left"/>
+      <w:pPr>
+        <w:tabs>
+          <w:tab w:val="num" w:pos="6480"/>
+        </w:tabs>
+        <w:ind w:left="6480" w:hanging="360"/>
+      </w:pPr>
+      <w:rPr>
+        <w:rFonts w:ascii="Wingdings" w:hAnsi="Wingdings" w:hint="default"/>
+        <w:sz w:val="20"/>
+      </w:rPr>
+    </w:lvl>
+  </w:abstractNum>
   <w:num w:numId="1" w16cid:durableId="1110512071">
+    <w:abstractNumId w:val="5"/>
+  </w:num>
+  <w:num w:numId="2" w16cid:durableId="1153988084">
     <w:abstractNumId w:val="1"/>
   </w:num>
-  <w:num w:numId="2" w16cid:durableId="1153988084">
+  <w:num w:numId="3" w16cid:durableId="1277250676">
+    <w:abstractNumId w:val="3"/>
+  </w:num>
+  <w:num w:numId="4" w16cid:durableId="949049189">
+    <w:abstractNumId w:val="2"/>
+  </w:num>
+  <w:num w:numId="5" w16cid:durableId="1635715025">
+    <w:abstractNumId w:val="6"/>
+  </w:num>
+  <w:num w:numId="6" w16cid:durableId="705371451">
     <w:abstractNumId w:val="0"/>
+  </w:num>
+  <w:num w:numId="7" w16cid:durableId="740710812">
+    <w:abstractNumId w:val="4"/>
   </w:num>
 </w:numbering>
 </file>
@@ -2700,7 +3942,6 @@
   <w:style w:type="character" w:default="1" w:styleId="Policepardfaut">
     <w:name w:val="Default Paragraph Font"/>
     <w:uiPriority w:val="1"/>
-    <w:semiHidden/>
     <w:unhideWhenUsed/>
   </w:style>
   <w:style w:type="table" w:default="1" w:styleId="TableauNormal">
@@ -3388,23 +4629,10 @@
 </file>
 
 <file path=customXml/item1.xml><?xml version="1.0" encoding="utf-8"?>
-<p:properties xmlns:p="http://schemas.microsoft.com/office/2006/metadata/properties" xmlns:xsi="http://www.w3.org/2001/XMLSchema-instance" xmlns:pc="http://schemas.microsoft.com/office/infopath/2007/PartnerControls">
-  <documentManagement>
-    <_activity xmlns="6cf9629a-3f6c-4f5f-bf5a-9990f6d83c58" xsi:nil="true"/>
-  </documentManagement>
-</p:properties>
+<b:Sources xmlns:b="http://schemas.openxmlformats.org/officeDocument/2006/bibliography" xmlns="http://schemas.openxmlformats.org/officeDocument/2006/bibliography" SelectedStyle="\APASixthEditionOfficeOnline.xsl" StyleName="APA" Version="6"/>
 </file>
 
 <file path=customXml/item2.xml><?xml version="1.0" encoding="utf-8"?>
-<?mso-contentType ?>
-<FormTemplates xmlns="http://schemas.microsoft.com/sharepoint/v3/contenttype/forms">
-  <Display>DocumentLibraryForm</Display>
-  <Edit>DocumentLibraryForm</Edit>
-  <New>DocumentLibraryForm</New>
-</FormTemplates>
-</file>
-
-<file path=customXml/item3.xml><?xml version="1.0" encoding="utf-8"?>
 <ct:contentTypeSchema xmlns:ct="http://schemas.microsoft.com/office/2006/metadata/contentType" xmlns:ma="http://schemas.microsoft.com/office/2006/metadata/properties/metaAttributes" ct:_="" ma:_="" ma:contentTypeName="Document" ma:contentTypeID="0x0101008A44E17421B74B4385ED2944255AEAB1" ma:contentTypeVersion="15" ma:contentTypeDescription="Crée un document." ma:contentTypeScope="" ma:versionID="93b5b18248b291ae417a942065f70d11">
   <xsd:schema xmlns:xsd="http://www.w3.org/2001/XMLSchema" xmlns:xs="http://www.w3.org/2001/XMLSchema" xmlns:p="http://schemas.microsoft.com/office/2006/metadata/properties" xmlns:ns3="6cf9629a-3f6c-4f5f-bf5a-9990f6d83c58" xmlns:ns4="ef367ba7-2429-4e09-a0d8-fa435a6b45cb" targetNamespace="http://schemas.microsoft.com/office/2006/metadata/properties" ma:root="true" ma:fieldsID="eb702e15d063576a5a91b0ad2108833a" ns3:_="" ns4:_="">
     <xsd:import namespace="6cf9629a-3f6c-4f5f-bf5a-9990f6d83c58"/>
@@ -3637,29 +4865,32 @@
 </ct:contentTypeSchema>
 </file>
 
+<file path=customXml/item3.xml><?xml version="1.0" encoding="utf-8"?>
+<?mso-contentType ?>
+<FormTemplates xmlns="http://schemas.microsoft.com/sharepoint/v3/contenttype/forms">
+  <Display>DocumentLibraryForm</Display>
+  <Edit>DocumentLibraryForm</Edit>
+  <New>DocumentLibraryForm</New>
+</FormTemplates>
+</file>
+
 <file path=customXml/item4.xml><?xml version="1.0" encoding="utf-8"?>
-<b:Sources xmlns:b="http://schemas.openxmlformats.org/officeDocument/2006/bibliography" xmlns="http://schemas.openxmlformats.org/officeDocument/2006/bibliography" SelectedStyle="\APASixthEditionOfficeOnline.xsl" StyleName="APA" Version="6"/>
+<p:properties xmlns:p="http://schemas.microsoft.com/office/2006/metadata/properties" xmlns:xsi="http://www.w3.org/2001/XMLSchema-instance" xmlns:pc="http://schemas.microsoft.com/office/infopath/2007/PartnerControls">
+  <documentManagement>
+    <_activity xmlns="6cf9629a-3f6c-4f5f-bf5a-9990f6d83c58" xsi:nil="true"/>
+  </documentManagement>
+</p:properties>
 </file>
 
 <file path=customXml/itemProps1.xml><?xml version="1.0" encoding="utf-8"?>
-<ds:datastoreItem xmlns:ds="http://schemas.openxmlformats.org/officeDocument/2006/customXml" ds:itemID="{FC71E993-84B4-48D2-950C-13C131ED85B2}">
+<ds:datastoreItem xmlns:ds="http://schemas.openxmlformats.org/officeDocument/2006/customXml" ds:itemID="{2C53BA18-DBA6-435B-B859-AC3BE7A8B3B8}">
   <ds:schemaRefs>
-    <ds:schemaRef ds:uri="http://schemas.microsoft.com/office/2006/metadata/properties"/>
-    <ds:schemaRef ds:uri="http://schemas.microsoft.com/office/infopath/2007/PartnerControls"/>
-    <ds:schemaRef ds:uri="6cf9629a-3f6c-4f5f-bf5a-9990f6d83c58"/>
+    <ds:schemaRef ds:uri="http://schemas.openxmlformats.org/officeDocument/2006/bibliography"/>
   </ds:schemaRefs>
 </ds:datastoreItem>
 </file>
 
 <file path=customXml/itemProps2.xml><?xml version="1.0" encoding="utf-8"?>
-<ds:datastoreItem xmlns:ds="http://schemas.openxmlformats.org/officeDocument/2006/customXml" ds:itemID="{FEB6B610-A6D6-49E3-96B6-D5561D46B112}">
-  <ds:schemaRefs>
-    <ds:schemaRef ds:uri="http://schemas.microsoft.com/sharepoint/v3/contenttype/forms"/>
-  </ds:schemaRefs>
-</ds:datastoreItem>
-</file>
-
-<file path=customXml/itemProps3.xml><?xml version="1.0" encoding="utf-8"?>
 <ds:datastoreItem xmlns:ds="http://schemas.openxmlformats.org/officeDocument/2006/customXml" ds:itemID="{4B077741-96F4-4963-97B4-37B81EC3BF78}">
   <ds:schemaRefs>
     <ds:schemaRef ds:uri="http://schemas.microsoft.com/office/2006/metadata/contentType"/>
@@ -3678,10 +4909,20 @@
 </ds:datastoreItem>
 </file>
 
+<file path=customXml/itemProps3.xml><?xml version="1.0" encoding="utf-8"?>
+<ds:datastoreItem xmlns:ds="http://schemas.openxmlformats.org/officeDocument/2006/customXml" ds:itemID="{FEB6B610-A6D6-49E3-96B6-D5561D46B112}">
+  <ds:schemaRefs>
+    <ds:schemaRef ds:uri="http://schemas.microsoft.com/sharepoint/v3/contenttype/forms"/>
+  </ds:schemaRefs>
+</ds:datastoreItem>
+</file>
+
 <file path=customXml/itemProps4.xml><?xml version="1.0" encoding="utf-8"?>
-<ds:datastoreItem xmlns:ds="http://schemas.openxmlformats.org/officeDocument/2006/customXml" ds:itemID="{2C53BA18-DBA6-435B-B859-AC3BE7A8B3B8}">
+<ds:datastoreItem xmlns:ds="http://schemas.openxmlformats.org/officeDocument/2006/customXml" ds:itemID="{FC71E993-84B4-48D2-950C-13C131ED85B2}">
   <ds:schemaRefs>
-    <ds:schemaRef ds:uri="http://schemas.openxmlformats.org/officeDocument/2006/bibliography"/>
+    <ds:schemaRef ds:uri="http://schemas.microsoft.com/office/2006/metadata/properties"/>
+    <ds:schemaRef ds:uri="http://schemas.microsoft.com/office/infopath/2007/PartnerControls"/>
+    <ds:schemaRef ds:uri="6cf9629a-3f6c-4f5f-bf5a-9990f6d83c58"/>
   </ds:schemaRefs>
 </ds:datastoreItem>
 </file>
</xml_diff>

<commit_message>
doc(rapport): mise à jour dur rapport de projet
</commit_message>
<xml_diff>
--- a/docs/R-320-POO-SchmidNathan-Rapport.docx
+++ b/docs/R-320-POO-SchmidNathan-Rapport.docx
@@ -1341,6 +1341,9 @@
       <w:bookmarkEnd w:id="5"/>
     </w:p>
     <w:p>
+      <w:pPr>
+        <w:pStyle w:val="Titre3"/>
+      </w:pPr>
       <w:r>
         <w:t>En tant q</w:t>
       </w:r>
@@ -1452,7 +1455,7 @@
     </w:p>
     <w:p>
       <w:pPr>
-        <w:ind w:left="360"/>
+        <w:pStyle w:val="Titre3"/>
       </w:pPr>
       <w:r>
         <w:t>En tant que joueur je veux avoir 5 défenses afin de me protéger des tirs ennemis.</w:t>
@@ -1528,6 +1531,9 @@
     </w:p>
     <w:p/>
     <w:p>
+      <w:pPr>
+        <w:pStyle w:val="Titre3"/>
+      </w:pPr>
       <w:r>
         <w:t>En tant que joueur je veux tirer des noisettes afin de pouvoir éliminer l’ennemi.</w:t>
       </w:r>
@@ -1626,6 +1632,9 @@
     </w:p>
     <w:p/>
     <w:p>
+      <w:pPr>
+        <w:pStyle w:val="Titre3"/>
+      </w:pPr>
       <w:r>
         <w:t>En tant que développeur je veux avoir des ennemis afin d'avoir un jeu dynamique et jouable.</w:t>
       </w:r>
@@ -1648,6 +1657,7 @@
         </w:numPr>
       </w:pPr>
       <w:r>
+        <w:lastRenderedPageBreak/>
         <w:t>L'ennemi de base : il se déplace et lance des projectiles sur le joueur.</w:t>
       </w:r>
     </w:p>
@@ -1659,7 +1669,6 @@
         </w:numPr>
       </w:pPr>
       <w:r>
-        <w:lastRenderedPageBreak/>
         <w:t>TANK : celui qui a plus de vie, qui est défini par sa couleur brune et sa taille (ou grandeur).</w:t>
       </w:r>
     </w:p>
@@ -1769,6 +1778,9 @@
     </w:p>
     <w:p/>
     <w:p>
+      <w:pPr>
+        <w:pStyle w:val="Titre3"/>
+      </w:pPr>
       <w:r>
         <w:t>En tant que joueur je veux voir mon score afficher afin de pouvoir suivre ma progression.</w:t>
       </w:r>
@@ -1867,6 +1879,9 @@
     </w:p>
     <w:p/>
     <w:p>
+      <w:pPr>
+        <w:pStyle w:val="Titre3"/>
+      </w:pPr>
       <w:r>
         <w:t>En tant que joueur je veux gagner afin de terminer la partie.</w:t>
       </w:r>
@@ -1914,7 +1929,11 @@
     </w:p>
     <w:p/>
     <w:p>
-      <w:r>
+      <w:pPr>
+        <w:pStyle w:val="Titre3"/>
+      </w:pPr>
+      <w:r>
+        <w:lastRenderedPageBreak/>
         <w:t>En tant que joueur je veux perdre afin de pouvoir terminer le jeu.</w:t>
       </w:r>
     </w:p>
@@ -2236,6 +2255,7 @@
         <w:rPr>
           <w:lang w:val="en-US"/>
         </w:rPr>
+        <w:lastRenderedPageBreak/>
         <w:t>Semaine</w:t>
       </w:r>
       <w:proofErr w:type="spellEnd"/>
@@ -2302,7 +2322,6 @@
         <w:rPr>
           <w:lang w:val="en-US"/>
         </w:rPr>
-        <w:lastRenderedPageBreak/>
         <w:t>Semaine</w:t>
       </w:r>
       <w:proofErr w:type="spellEnd"/>
@@ -3790,7 +3809,6 @@
     <w:next w:val="Normal"/>
     <w:link w:val="Titre3Car"/>
     <w:uiPriority w:val="9"/>
-    <w:semiHidden/>
     <w:unhideWhenUsed/>
     <w:qFormat/>
     <w:rsid w:val="00122748"/>
@@ -3996,7 +4014,6 @@
     <w:basedOn w:val="Policepardfaut"/>
     <w:link w:val="Titre3"/>
     <w:uiPriority w:val="9"/>
-    <w:semiHidden/>
     <w:rsid w:val="00122748"/>
     <w:rPr>
       <w:rFonts w:eastAsiaTheme="majorEastAsia" w:cstheme="majorBidi"/>

</xml_diff>

<commit_message>
chore(rapport): Mise à jour du rapport de projet
</commit_message>
<xml_diff>
--- a/docs/R-320-POO-SchmidNathan-Rapport.docx
+++ b/docs/R-320-POO-SchmidNathan-Rapport.docx
@@ -88,7 +88,7 @@
           <w:r>
             <w:fldChar w:fldCharType="separate"/>
           </w:r>
-          <w:hyperlink w:anchor="_Toc241241767" w:history="1">
+          <w:hyperlink w:anchor="_Toc244343713" w:history="1">
             <w:r>
               <w:rPr>
                 <w:rStyle w:val="Lienhypertexte"/>
@@ -115,7 +115,7 @@
                 <w:noProof/>
                 <w:webHidden/>
               </w:rPr>
-              <w:instrText xml:space="preserve"> PAGEREF _Toc241241767 \h </w:instrText>
+              <w:instrText xml:space="preserve"> PAGEREF _Toc244343713 \h </w:instrText>
             </w:r>
             <w:r>
               <w:rPr>
@@ -135,7 +135,7 @@
                 <w:noProof/>
                 <w:webHidden/>
               </w:rPr>
-              <w:t>1</w:t>
+              <w:t>2</w:t>
             </w:r>
             <w:r>
               <w:rPr>
@@ -158,7 +158,7 @@
               <w:lang w:eastAsia="fr-CH"/>
             </w:rPr>
           </w:pPr>
-          <w:hyperlink w:anchor="_Toc241241768" w:history="1">
+          <w:hyperlink w:anchor="_Toc244343714" w:history="1">
             <w:r>
               <w:rPr>
                 <w:rStyle w:val="Lienhypertexte"/>
@@ -185,7 +185,7 @@
                 <w:noProof/>
                 <w:webHidden/>
               </w:rPr>
-              <w:instrText xml:space="preserve"> PAGEREF _Toc241241768 \h </w:instrText>
+              <w:instrText xml:space="preserve"> PAGEREF _Toc244343714 \h </w:instrText>
             </w:r>
             <w:r>
               <w:rPr>
@@ -228,7 +228,7 @@
               <w:lang w:eastAsia="fr-CH"/>
             </w:rPr>
           </w:pPr>
-          <w:hyperlink w:anchor="_Toc241241769" w:history="1">
+          <w:hyperlink w:anchor="_Toc244343715" w:history="1">
             <w:r>
               <w:rPr>
                 <w:rStyle w:val="Lienhypertexte"/>
@@ -255,7 +255,7 @@
                 <w:noProof/>
                 <w:webHidden/>
               </w:rPr>
-              <w:instrText xml:space="preserve"> PAGEREF _Toc241241769 \h </w:instrText>
+              <w:instrText xml:space="preserve"> PAGEREF _Toc244343715 \h </w:instrText>
             </w:r>
             <w:r>
               <w:rPr>
@@ -298,7 +298,7 @@
               <w:lang w:eastAsia="fr-CH"/>
             </w:rPr>
           </w:pPr>
-          <w:hyperlink w:anchor="_Toc241241770" w:history="1">
+          <w:hyperlink w:anchor="_Toc244343716" w:history="1">
             <w:r>
               <w:rPr>
                 <w:rStyle w:val="Lienhypertexte"/>
@@ -325,7 +325,7 @@
                 <w:noProof/>
                 <w:webHidden/>
               </w:rPr>
-              <w:instrText xml:space="preserve"> PAGEREF _Toc241241770 \h </w:instrText>
+              <w:instrText xml:space="preserve"> PAGEREF _Toc244343716 \h </w:instrText>
             </w:r>
             <w:r>
               <w:rPr>
@@ -368,7 +368,7 @@
               <w:lang w:eastAsia="fr-CH"/>
             </w:rPr>
           </w:pPr>
-          <w:hyperlink w:anchor="_Toc241241771" w:history="1">
+          <w:hyperlink w:anchor="_Toc244343717" w:history="1">
             <w:r>
               <w:rPr>
                 <w:rStyle w:val="Lienhypertexte"/>
@@ -395,7 +395,7 @@
                 <w:noProof/>
                 <w:webHidden/>
               </w:rPr>
-              <w:instrText xml:space="preserve"> PAGEREF _Toc241241771 \h </w:instrText>
+              <w:instrText xml:space="preserve"> PAGEREF _Toc244343717 \h </w:instrText>
             </w:r>
             <w:r>
               <w:rPr>
@@ -415,7 +415,7 @@
                 <w:noProof/>
                 <w:webHidden/>
               </w:rPr>
-              <w:t>2</w:t>
+              <w:t>3</w:t>
             </w:r>
             <w:r>
               <w:rPr>
@@ -438,7 +438,7 @@
               <w:lang w:eastAsia="fr-CH"/>
             </w:rPr>
           </w:pPr>
-          <w:hyperlink w:anchor="_Toc241241772" w:history="1">
+          <w:hyperlink w:anchor="_Toc244343718" w:history="1">
             <w:r>
               <w:rPr>
                 <w:rStyle w:val="Lienhypertexte"/>
@@ -465,7 +465,7 @@
                 <w:noProof/>
                 <w:webHidden/>
               </w:rPr>
-              <w:instrText xml:space="preserve"> PAGEREF _Toc241241772 \h </w:instrText>
+              <w:instrText xml:space="preserve"> PAGEREF _Toc244343718 \h </w:instrText>
             </w:r>
             <w:r>
               <w:rPr>
@@ -485,7 +485,483 @@
                 <w:noProof/>
                 <w:webHidden/>
               </w:rPr>
-              <w:t>2</w:t>
+              <w:t>3</w:t>
+            </w:r>
+            <w:r>
+              <w:rPr>
+                <w:noProof/>
+                <w:webHidden/>
+              </w:rPr>
+              <w:fldChar w:fldCharType="end"/>
+            </w:r>
+          </w:hyperlink>
+        </w:p>
+        <w:p>
+          <w:pPr>
+            <w:pStyle w:val="TM3"/>
+            <w:tabs>
+              <w:tab w:val="right" w:leader="dot" w:pos="9062"/>
+            </w:tabs>
+            <w:rPr>
+              <w:noProof/>
+            </w:rPr>
+          </w:pPr>
+          <w:hyperlink w:anchor="_Toc244343719" w:history="1">
+            <w:r>
+              <w:rPr>
+                <w:rStyle w:val="Lienhypertexte"/>
+                <w:noProof/>
+              </w:rPr>
+              <w:t>En tant que joueur je veux être capable de me déplacer afin de pouvoir éviter les tirs ennemis.</w:t>
+            </w:r>
+            <w:r>
+              <w:rPr>
+                <w:noProof/>
+                <w:webHidden/>
+              </w:rPr>
+              <w:tab/>
+            </w:r>
+            <w:r>
+              <w:rPr>
+                <w:noProof/>
+                <w:webHidden/>
+              </w:rPr>
+              <w:fldChar w:fldCharType="begin"/>
+            </w:r>
+            <w:r>
+              <w:rPr>
+                <w:noProof/>
+                <w:webHidden/>
+              </w:rPr>
+              <w:instrText xml:space="preserve"> PAGEREF _Toc244343719 \h </w:instrText>
+            </w:r>
+            <w:r>
+              <w:rPr>
+                <w:noProof/>
+                <w:webHidden/>
+              </w:rPr>
+            </w:r>
+            <w:r>
+              <w:rPr>
+                <w:noProof/>
+                <w:webHidden/>
+              </w:rPr>
+              <w:fldChar w:fldCharType="separate"/>
+            </w:r>
+            <w:r>
+              <w:rPr>
+                <w:noProof/>
+                <w:webHidden/>
+              </w:rPr>
+              <w:t>3</w:t>
+            </w:r>
+            <w:r>
+              <w:rPr>
+                <w:noProof/>
+                <w:webHidden/>
+              </w:rPr>
+              <w:fldChar w:fldCharType="end"/>
+            </w:r>
+          </w:hyperlink>
+        </w:p>
+        <w:p>
+          <w:pPr>
+            <w:pStyle w:val="TM3"/>
+            <w:tabs>
+              <w:tab w:val="right" w:leader="dot" w:pos="9062"/>
+            </w:tabs>
+            <w:rPr>
+              <w:noProof/>
+            </w:rPr>
+          </w:pPr>
+          <w:hyperlink w:anchor="_Toc244343720" w:history="1">
+            <w:r>
+              <w:rPr>
+                <w:rStyle w:val="Lienhypertexte"/>
+                <w:noProof/>
+              </w:rPr>
+              <w:t>En tant que joueur je veux avoir 5 défenses afin de me protéger des tirs ennemis.</w:t>
+            </w:r>
+            <w:r>
+              <w:rPr>
+                <w:noProof/>
+                <w:webHidden/>
+              </w:rPr>
+              <w:tab/>
+            </w:r>
+            <w:r>
+              <w:rPr>
+                <w:noProof/>
+                <w:webHidden/>
+              </w:rPr>
+              <w:fldChar w:fldCharType="begin"/>
+            </w:r>
+            <w:r>
+              <w:rPr>
+                <w:noProof/>
+                <w:webHidden/>
+              </w:rPr>
+              <w:instrText xml:space="preserve"> PAGEREF _Toc244343720 \h </w:instrText>
+            </w:r>
+            <w:r>
+              <w:rPr>
+                <w:noProof/>
+                <w:webHidden/>
+              </w:rPr>
+            </w:r>
+            <w:r>
+              <w:rPr>
+                <w:noProof/>
+                <w:webHidden/>
+              </w:rPr>
+              <w:fldChar w:fldCharType="separate"/>
+            </w:r>
+            <w:r>
+              <w:rPr>
+                <w:noProof/>
+                <w:webHidden/>
+              </w:rPr>
+              <w:t>3</w:t>
+            </w:r>
+            <w:r>
+              <w:rPr>
+                <w:noProof/>
+                <w:webHidden/>
+              </w:rPr>
+              <w:fldChar w:fldCharType="end"/>
+            </w:r>
+          </w:hyperlink>
+        </w:p>
+        <w:p>
+          <w:pPr>
+            <w:pStyle w:val="TM3"/>
+            <w:tabs>
+              <w:tab w:val="right" w:leader="dot" w:pos="9062"/>
+            </w:tabs>
+            <w:rPr>
+              <w:noProof/>
+            </w:rPr>
+          </w:pPr>
+          <w:hyperlink w:anchor="_Toc244343721" w:history="1">
+            <w:r>
+              <w:rPr>
+                <w:rStyle w:val="Lienhypertexte"/>
+                <w:noProof/>
+              </w:rPr>
+              <w:t>En tant que joueur je veux tirer des noisettes afin de pouvoir éliminer l’ennemi.</w:t>
+            </w:r>
+            <w:r>
+              <w:rPr>
+                <w:noProof/>
+                <w:webHidden/>
+              </w:rPr>
+              <w:tab/>
+            </w:r>
+            <w:r>
+              <w:rPr>
+                <w:noProof/>
+                <w:webHidden/>
+              </w:rPr>
+              <w:fldChar w:fldCharType="begin"/>
+            </w:r>
+            <w:r>
+              <w:rPr>
+                <w:noProof/>
+                <w:webHidden/>
+              </w:rPr>
+              <w:instrText xml:space="preserve"> PAGEREF _Toc244343721 \h </w:instrText>
+            </w:r>
+            <w:r>
+              <w:rPr>
+                <w:noProof/>
+                <w:webHidden/>
+              </w:rPr>
+            </w:r>
+            <w:r>
+              <w:rPr>
+                <w:noProof/>
+                <w:webHidden/>
+              </w:rPr>
+              <w:fldChar w:fldCharType="separate"/>
+            </w:r>
+            <w:r>
+              <w:rPr>
+                <w:noProof/>
+                <w:webHidden/>
+              </w:rPr>
+              <w:t>3</w:t>
+            </w:r>
+            <w:r>
+              <w:rPr>
+                <w:noProof/>
+                <w:webHidden/>
+              </w:rPr>
+              <w:fldChar w:fldCharType="end"/>
+            </w:r>
+          </w:hyperlink>
+        </w:p>
+        <w:p>
+          <w:pPr>
+            <w:pStyle w:val="TM3"/>
+            <w:tabs>
+              <w:tab w:val="right" w:leader="dot" w:pos="9062"/>
+            </w:tabs>
+            <w:rPr>
+              <w:noProof/>
+            </w:rPr>
+          </w:pPr>
+          <w:hyperlink w:anchor="_Toc244343722" w:history="1">
+            <w:r>
+              <w:rPr>
+                <w:rStyle w:val="Lienhypertexte"/>
+                <w:noProof/>
+              </w:rPr>
+              <w:t>En tant que développeur je veux avoir des ennemis afin d'avoir un jeu dynamique et jouable.</w:t>
+            </w:r>
+            <w:r>
+              <w:rPr>
+                <w:noProof/>
+                <w:webHidden/>
+              </w:rPr>
+              <w:tab/>
+            </w:r>
+            <w:r>
+              <w:rPr>
+                <w:noProof/>
+                <w:webHidden/>
+              </w:rPr>
+              <w:fldChar w:fldCharType="begin"/>
+            </w:r>
+            <w:r>
+              <w:rPr>
+                <w:noProof/>
+                <w:webHidden/>
+              </w:rPr>
+              <w:instrText xml:space="preserve"> PAGEREF _Toc244343722 \h </w:instrText>
+            </w:r>
+            <w:r>
+              <w:rPr>
+                <w:noProof/>
+                <w:webHidden/>
+              </w:rPr>
+            </w:r>
+            <w:r>
+              <w:rPr>
+                <w:noProof/>
+                <w:webHidden/>
+              </w:rPr>
+              <w:fldChar w:fldCharType="separate"/>
+            </w:r>
+            <w:r>
+              <w:rPr>
+                <w:noProof/>
+                <w:webHidden/>
+              </w:rPr>
+              <w:t>4</w:t>
+            </w:r>
+            <w:r>
+              <w:rPr>
+                <w:noProof/>
+                <w:webHidden/>
+              </w:rPr>
+              <w:fldChar w:fldCharType="end"/>
+            </w:r>
+          </w:hyperlink>
+        </w:p>
+        <w:p>
+          <w:pPr>
+            <w:pStyle w:val="TM3"/>
+            <w:tabs>
+              <w:tab w:val="right" w:leader="dot" w:pos="9062"/>
+            </w:tabs>
+            <w:rPr>
+              <w:noProof/>
+            </w:rPr>
+          </w:pPr>
+          <w:hyperlink w:anchor="_Toc244343723" w:history="1">
+            <w:r>
+              <w:rPr>
+                <w:rStyle w:val="Lienhypertexte"/>
+                <w:noProof/>
+              </w:rPr>
+              <w:t>En tant que joueur je veux voir mon score afficher afin de pouvoir suivre ma progression.</w:t>
+            </w:r>
+            <w:r>
+              <w:rPr>
+                <w:noProof/>
+                <w:webHidden/>
+              </w:rPr>
+              <w:tab/>
+            </w:r>
+            <w:r>
+              <w:rPr>
+                <w:noProof/>
+                <w:webHidden/>
+              </w:rPr>
+              <w:fldChar w:fldCharType="begin"/>
+            </w:r>
+            <w:r>
+              <w:rPr>
+                <w:noProof/>
+                <w:webHidden/>
+              </w:rPr>
+              <w:instrText xml:space="preserve"> PAGEREF _Toc244343723 \h </w:instrText>
+            </w:r>
+            <w:r>
+              <w:rPr>
+                <w:noProof/>
+                <w:webHidden/>
+              </w:rPr>
+            </w:r>
+            <w:r>
+              <w:rPr>
+                <w:noProof/>
+                <w:webHidden/>
+              </w:rPr>
+              <w:fldChar w:fldCharType="separate"/>
+            </w:r>
+            <w:r>
+              <w:rPr>
+                <w:noProof/>
+                <w:webHidden/>
+              </w:rPr>
+              <w:t>4</w:t>
+            </w:r>
+            <w:r>
+              <w:rPr>
+                <w:noProof/>
+                <w:webHidden/>
+              </w:rPr>
+              <w:fldChar w:fldCharType="end"/>
+            </w:r>
+          </w:hyperlink>
+        </w:p>
+        <w:p>
+          <w:pPr>
+            <w:pStyle w:val="TM3"/>
+            <w:tabs>
+              <w:tab w:val="right" w:leader="dot" w:pos="9062"/>
+            </w:tabs>
+            <w:rPr>
+              <w:noProof/>
+            </w:rPr>
+          </w:pPr>
+          <w:hyperlink w:anchor="_Toc244343724" w:history="1">
+            <w:r>
+              <w:rPr>
+                <w:rStyle w:val="Lienhypertexte"/>
+                <w:noProof/>
+              </w:rPr>
+              <w:t>En tant que joueur je veux gagner afin de terminer la partie.</w:t>
+            </w:r>
+            <w:r>
+              <w:rPr>
+                <w:noProof/>
+                <w:webHidden/>
+              </w:rPr>
+              <w:tab/>
+            </w:r>
+            <w:r>
+              <w:rPr>
+                <w:noProof/>
+                <w:webHidden/>
+              </w:rPr>
+              <w:fldChar w:fldCharType="begin"/>
+            </w:r>
+            <w:r>
+              <w:rPr>
+                <w:noProof/>
+                <w:webHidden/>
+              </w:rPr>
+              <w:instrText xml:space="preserve"> PAGEREF _Toc244343724 \h </w:instrText>
+            </w:r>
+            <w:r>
+              <w:rPr>
+                <w:noProof/>
+                <w:webHidden/>
+              </w:rPr>
+            </w:r>
+            <w:r>
+              <w:rPr>
+                <w:noProof/>
+                <w:webHidden/>
+              </w:rPr>
+              <w:fldChar w:fldCharType="separate"/>
+            </w:r>
+            <w:r>
+              <w:rPr>
+                <w:noProof/>
+                <w:webHidden/>
+              </w:rPr>
+              <w:t>5</w:t>
+            </w:r>
+            <w:r>
+              <w:rPr>
+                <w:noProof/>
+                <w:webHidden/>
+              </w:rPr>
+              <w:fldChar w:fldCharType="end"/>
+            </w:r>
+          </w:hyperlink>
+        </w:p>
+        <w:p>
+          <w:pPr>
+            <w:pStyle w:val="TM3"/>
+            <w:tabs>
+              <w:tab w:val="right" w:leader="dot" w:pos="9062"/>
+            </w:tabs>
+            <w:rPr>
+              <w:noProof/>
+            </w:rPr>
+          </w:pPr>
+          <w:hyperlink w:anchor="_Toc244343725" w:history="1">
+            <w:r>
+              <w:rPr>
+                <w:rStyle w:val="Lienhypertexte"/>
+                <w:noProof/>
+              </w:rPr>
+              <w:t>En tant que joueur je veux perdre afin de pouvoir terminer le jeu.</w:t>
+            </w:r>
+            <w:r>
+              <w:rPr>
+                <w:noProof/>
+                <w:webHidden/>
+              </w:rPr>
+              <w:tab/>
+            </w:r>
+            <w:r>
+              <w:rPr>
+                <w:noProof/>
+                <w:webHidden/>
+              </w:rPr>
+              <w:fldChar w:fldCharType="begin"/>
+            </w:r>
+            <w:r>
+              <w:rPr>
+                <w:noProof/>
+                <w:webHidden/>
+              </w:rPr>
+              <w:instrText xml:space="preserve"> PAGEREF _Toc244343725 \h </w:instrText>
+            </w:r>
+            <w:r>
+              <w:rPr>
+                <w:noProof/>
+                <w:webHidden/>
+              </w:rPr>
+            </w:r>
+            <w:r>
+              <w:rPr>
+                <w:noProof/>
+                <w:webHidden/>
+              </w:rPr>
+              <w:fldChar w:fldCharType="separate"/>
+            </w:r>
+            <w:r>
+              <w:rPr>
+                <w:noProof/>
+                <w:webHidden/>
+              </w:rPr>
+              <w:t>5</w:t>
             </w:r>
             <w:r>
               <w:rPr>
@@ -508,7 +984,7 @@
               <w:lang w:eastAsia="fr-CH"/>
             </w:rPr>
           </w:pPr>
-          <w:hyperlink w:anchor="_Toc241241773" w:history="1">
+          <w:hyperlink w:anchor="_Toc244343726" w:history="1">
             <w:r>
               <w:rPr>
                 <w:rStyle w:val="Lienhypertexte"/>
@@ -535,7 +1011,7 @@
                 <w:noProof/>
                 <w:webHidden/>
               </w:rPr>
-              <w:instrText xml:space="preserve"> PAGEREF _Toc241241773 \h </w:instrText>
+              <w:instrText xml:space="preserve"> PAGEREF _Toc244343726 \h </w:instrText>
             </w:r>
             <w:r>
               <w:rPr>
@@ -555,7 +1031,7 @@
                 <w:noProof/>
                 <w:webHidden/>
               </w:rPr>
-              <w:t>3</w:t>
+              <w:t>5</w:t>
             </w:r>
             <w:r>
               <w:rPr>
@@ -578,7 +1054,7 @@
               <w:lang w:eastAsia="fr-CH"/>
             </w:rPr>
           </w:pPr>
-          <w:hyperlink w:anchor="_Toc241241774" w:history="1">
+          <w:hyperlink w:anchor="_Toc244343727" w:history="1">
             <w:r>
               <w:rPr>
                 <w:rStyle w:val="Lienhypertexte"/>
@@ -605,7 +1081,7 @@
                 <w:noProof/>
                 <w:webHidden/>
               </w:rPr>
-              <w:instrText xml:space="preserve"> PAGEREF _Toc241241774 \h </w:instrText>
+              <w:instrText xml:space="preserve"> PAGEREF _Toc244343727 \h </w:instrText>
             </w:r>
             <w:r>
               <w:rPr>
@@ -625,7 +1101,7 @@
                 <w:noProof/>
                 <w:webHidden/>
               </w:rPr>
-              <w:t>3</w:t>
+              <w:t>5</w:t>
             </w:r>
             <w:r>
               <w:rPr>
@@ -648,7 +1124,7 @@
               <w:lang w:eastAsia="fr-CH"/>
             </w:rPr>
           </w:pPr>
-          <w:hyperlink w:anchor="_Toc241241775" w:history="1">
+          <w:hyperlink w:anchor="_Toc244343728" w:history="1">
             <w:r>
               <w:rPr>
                 <w:rStyle w:val="Lienhypertexte"/>
@@ -675,7 +1151,7 @@
                 <w:noProof/>
                 <w:webHidden/>
               </w:rPr>
-              <w:instrText xml:space="preserve"> PAGEREF _Toc241241775 \h </w:instrText>
+              <w:instrText xml:space="preserve"> PAGEREF _Toc244343728 \h </w:instrText>
             </w:r>
             <w:r>
               <w:rPr>
@@ -695,7 +1171,7 @@
                 <w:noProof/>
                 <w:webHidden/>
               </w:rPr>
-              <w:t>3</w:t>
+              <w:t>5</w:t>
             </w:r>
             <w:r>
               <w:rPr>
@@ -718,7 +1194,7 @@
               <w:lang w:eastAsia="fr-CH"/>
             </w:rPr>
           </w:pPr>
-          <w:hyperlink w:anchor="_Toc241241776" w:history="1">
+          <w:hyperlink w:anchor="_Toc244343729" w:history="1">
             <w:r>
               <w:rPr>
                 <w:rStyle w:val="Lienhypertexte"/>
@@ -745,7 +1221,7 @@
                 <w:noProof/>
                 <w:webHidden/>
               </w:rPr>
-              <w:instrText xml:space="preserve"> PAGEREF _Toc241241776 \h </w:instrText>
+              <w:instrText xml:space="preserve"> PAGEREF _Toc244343729 \h </w:instrText>
             </w:r>
             <w:r>
               <w:rPr>
@@ -765,7 +1241,7 @@
                 <w:noProof/>
                 <w:webHidden/>
               </w:rPr>
-              <w:t>3</w:t>
+              <w:t>5</w:t>
             </w:r>
             <w:r>
               <w:rPr>
@@ -788,7 +1264,7 @@
               <w:lang w:eastAsia="fr-CH"/>
             </w:rPr>
           </w:pPr>
-          <w:hyperlink w:anchor="_Toc241241777" w:history="1">
+          <w:hyperlink w:anchor="_Toc244343730" w:history="1">
             <w:r>
               <w:rPr>
                 <w:rStyle w:val="Lienhypertexte"/>
@@ -815,7 +1291,7 @@
                 <w:noProof/>
                 <w:webHidden/>
               </w:rPr>
-              <w:instrText xml:space="preserve"> PAGEREF _Toc241241777 \h </w:instrText>
+              <w:instrText xml:space="preserve"> PAGEREF _Toc244343730 \h </w:instrText>
             </w:r>
             <w:r>
               <w:rPr>
@@ -835,7 +1311,7 @@
                 <w:noProof/>
                 <w:webHidden/>
               </w:rPr>
-              <w:t>3</w:t>
+              <w:t>6</w:t>
             </w:r>
             <w:r>
               <w:rPr>
@@ -858,7 +1334,7 @@
               <w:lang w:eastAsia="fr-CH"/>
             </w:rPr>
           </w:pPr>
-          <w:hyperlink w:anchor="_Toc241241778" w:history="1">
+          <w:hyperlink w:anchor="_Toc244343731" w:history="1">
             <w:r>
               <w:rPr>
                 <w:rStyle w:val="Lienhypertexte"/>
@@ -885,7 +1361,7 @@
                 <w:noProof/>
                 <w:webHidden/>
               </w:rPr>
-              <w:instrText xml:space="preserve"> PAGEREF _Toc241241778 \h </w:instrText>
+              <w:instrText xml:space="preserve"> PAGEREF _Toc244343731 \h </w:instrText>
             </w:r>
             <w:r>
               <w:rPr>
@@ -905,7 +1381,7 @@
                 <w:noProof/>
                 <w:webHidden/>
               </w:rPr>
-              <w:t>3</w:t>
+              <w:t>6</w:t>
             </w:r>
             <w:r>
               <w:rPr>
@@ -928,7 +1404,7 @@
               <w:lang w:eastAsia="fr-CH"/>
             </w:rPr>
           </w:pPr>
-          <w:hyperlink w:anchor="_Toc241241779" w:history="1">
+          <w:hyperlink w:anchor="_Toc244343732" w:history="1">
             <w:r>
               <w:rPr>
                 <w:rStyle w:val="Lienhypertexte"/>
@@ -955,7 +1431,7 @@
                 <w:noProof/>
                 <w:webHidden/>
               </w:rPr>
-              <w:instrText xml:space="preserve"> PAGEREF _Toc241241779 \h </w:instrText>
+              <w:instrText xml:space="preserve"> PAGEREF _Toc244343732 \h </w:instrText>
             </w:r>
             <w:r>
               <w:rPr>
@@ -975,7 +1451,7 @@
                 <w:noProof/>
                 <w:webHidden/>
               </w:rPr>
-              <w:t>3</w:t>
+              <w:t>6</w:t>
             </w:r>
             <w:r>
               <w:rPr>
@@ -998,7 +1474,7 @@
               <w:lang w:eastAsia="fr-CH"/>
             </w:rPr>
           </w:pPr>
-          <w:hyperlink w:anchor="_Toc241241780" w:history="1">
+          <w:hyperlink w:anchor="_Toc244343733" w:history="1">
             <w:r>
               <w:rPr>
                 <w:rStyle w:val="Lienhypertexte"/>
@@ -1026,7 +1502,7 @@
                 <w:noProof/>
                 <w:webHidden/>
               </w:rPr>
-              <w:instrText xml:space="preserve"> PAGEREF _Toc241241780 \h </w:instrText>
+              <w:instrText xml:space="preserve"> PAGEREF _Toc244343733 \h </w:instrText>
             </w:r>
             <w:r>
               <w:rPr>
@@ -1046,7 +1522,7 @@
                 <w:noProof/>
                 <w:webHidden/>
               </w:rPr>
-              <w:t>4</w:t>
+              <w:t>6</w:t>
             </w:r>
             <w:r>
               <w:rPr>
@@ -1069,7 +1545,7 @@
               <w:lang w:eastAsia="fr-CH"/>
             </w:rPr>
           </w:pPr>
-          <w:hyperlink w:anchor="_Toc241241781" w:history="1">
+          <w:hyperlink w:anchor="_Toc244343734" w:history="1">
             <w:r>
               <w:rPr>
                 <w:rStyle w:val="Lienhypertexte"/>
@@ -1097,7 +1573,7 @@
                 <w:noProof/>
                 <w:webHidden/>
               </w:rPr>
-              <w:instrText xml:space="preserve"> PAGEREF _Toc241241781 \h </w:instrText>
+              <w:instrText xml:space="preserve"> PAGEREF _Toc244343734 \h </w:instrText>
             </w:r>
             <w:r>
               <w:rPr>
@@ -1117,7 +1593,147 @@
                 <w:noProof/>
                 <w:webHidden/>
               </w:rPr>
-              <w:t>4</w:t>
+              <w:t>6</w:t>
+            </w:r>
+            <w:r>
+              <w:rPr>
+                <w:noProof/>
+                <w:webHidden/>
+              </w:rPr>
+              <w:fldChar w:fldCharType="end"/>
+            </w:r>
+          </w:hyperlink>
+        </w:p>
+        <w:p>
+          <w:pPr>
+            <w:pStyle w:val="TM1"/>
+            <w:tabs>
+              <w:tab w:val="right" w:leader="dot" w:pos="9062"/>
+            </w:tabs>
+            <w:rPr>
+              <w:rFonts w:eastAsiaTheme="minorEastAsia"/>
+              <w:noProof/>
+              <w:lang w:eastAsia="fr-CH"/>
+            </w:rPr>
+          </w:pPr>
+          <w:hyperlink w:anchor="_Toc244343735" w:history="1">
+            <w:r>
+              <w:rPr>
+                <w:rStyle w:val="Lienhypertexte"/>
+                <w:noProof/>
+              </w:rPr>
+              <w:t>Tests Unitaires</w:t>
+            </w:r>
+            <w:r>
+              <w:rPr>
+                <w:noProof/>
+                <w:webHidden/>
+              </w:rPr>
+              <w:tab/>
+            </w:r>
+            <w:r>
+              <w:rPr>
+                <w:noProof/>
+                <w:webHidden/>
+              </w:rPr>
+              <w:fldChar w:fldCharType="begin"/>
+            </w:r>
+            <w:r>
+              <w:rPr>
+                <w:noProof/>
+                <w:webHidden/>
+              </w:rPr>
+              <w:instrText xml:space="preserve"> PAGEREF _Toc244343735 \h </w:instrText>
+            </w:r>
+            <w:r>
+              <w:rPr>
+                <w:noProof/>
+                <w:webHidden/>
+              </w:rPr>
+            </w:r>
+            <w:r>
+              <w:rPr>
+                <w:noProof/>
+                <w:webHidden/>
+              </w:rPr>
+              <w:fldChar w:fldCharType="separate"/>
+            </w:r>
+            <w:r>
+              <w:rPr>
+                <w:noProof/>
+                <w:webHidden/>
+              </w:rPr>
+              <w:t>6</w:t>
+            </w:r>
+            <w:r>
+              <w:rPr>
+                <w:noProof/>
+                <w:webHidden/>
+              </w:rPr>
+              <w:fldChar w:fldCharType="end"/>
+            </w:r>
+          </w:hyperlink>
+        </w:p>
+        <w:p>
+          <w:pPr>
+            <w:pStyle w:val="TM1"/>
+            <w:tabs>
+              <w:tab w:val="right" w:leader="dot" w:pos="9062"/>
+            </w:tabs>
+            <w:rPr>
+              <w:rFonts w:eastAsiaTheme="minorEastAsia"/>
+              <w:noProof/>
+              <w:lang w:eastAsia="fr-CH"/>
+            </w:rPr>
+          </w:pPr>
+          <w:hyperlink w:anchor="_Toc244343736" w:history="1">
+            <w:r>
+              <w:rPr>
+                <w:rStyle w:val="Lienhypertexte"/>
+                <w:noProof/>
+              </w:rPr>
+              <w:t>Utilisation de l’IA</w:t>
+            </w:r>
+            <w:r>
+              <w:rPr>
+                <w:noProof/>
+                <w:webHidden/>
+              </w:rPr>
+              <w:tab/>
+            </w:r>
+            <w:r>
+              <w:rPr>
+                <w:noProof/>
+                <w:webHidden/>
+              </w:rPr>
+              <w:fldChar w:fldCharType="begin"/>
+            </w:r>
+            <w:r>
+              <w:rPr>
+                <w:noProof/>
+                <w:webHidden/>
+              </w:rPr>
+              <w:instrText xml:space="preserve"> PAGEREF _Toc244343736 \h </w:instrText>
+            </w:r>
+            <w:r>
+              <w:rPr>
+                <w:noProof/>
+                <w:webHidden/>
+              </w:rPr>
+            </w:r>
+            <w:r>
+              <w:rPr>
+                <w:noProof/>
+                <w:webHidden/>
+              </w:rPr>
+              <w:fldChar w:fldCharType="separate"/>
+            </w:r>
+            <w:r>
+              <w:rPr>
+                <w:noProof/>
+                <w:webHidden/>
+              </w:rPr>
+              <w:t>6</w:t>
             </w:r>
             <w:r>
               <w:rPr>
@@ -1135,6 +1751,7 @@
               <w:bCs/>
               <w:lang w:val="fr-FR"/>
             </w:rPr>
+            <w:lastRenderedPageBreak/>
             <w:fldChar w:fldCharType="end"/>
           </w:r>
         </w:p>
@@ -1183,7 +1800,7 @@
       <w:pPr>
         <w:pStyle w:val="Titre1"/>
       </w:pPr>
-      <w:bookmarkStart w:id="0" w:name="_Toc241241767"/>
+      <w:bookmarkStart w:id="0" w:name="_Toc244343713"/>
       <w:r>
         <w:t>Introduction</w:t>
       </w:r>
@@ -1214,9 +1831,8 @@
       <w:pPr>
         <w:pStyle w:val="Titre1"/>
       </w:pPr>
-      <w:bookmarkStart w:id="1" w:name="_Toc241241768"/>
-      <w:r>
-        <w:lastRenderedPageBreak/>
+      <w:bookmarkStart w:id="1" w:name="_Toc244343714"/>
+      <w:r>
         <w:t>Contexte</w:t>
       </w:r>
       <w:bookmarkEnd w:id="1"/>
@@ -1230,7 +1846,7 @@
       <w:pPr>
         <w:pStyle w:val="Titre1"/>
       </w:pPr>
-      <w:bookmarkStart w:id="2" w:name="_Toc241241769"/>
+      <w:bookmarkStart w:id="2" w:name="_Toc244343715"/>
       <w:r>
         <w:t>Objectif principal</w:t>
       </w:r>
@@ -1245,7 +1861,7 @@
       <w:pPr>
         <w:pStyle w:val="Titre1"/>
       </w:pPr>
-      <w:bookmarkStart w:id="3" w:name="_Toc241241770"/>
+      <w:bookmarkStart w:id="3" w:name="_Toc244343716"/>
       <w:r>
         <w:t>Maquettes</w:t>
       </w:r>
@@ -1318,8 +1934,9 @@
       <w:pPr>
         <w:pStyle w:val="Titre1"/>
       </w:pPr>
-      <w:bookmarkStart w:id="4" w:name="_Toc241241771"/>
-      <w:r>
+      <w:bookmarkStart w:id="4" w:name="_Toc244343717"/>
+      <w:r>
+        <w:lastRenderedPageBreak/>
         <w:t>Analyse</w:t>
       </w:r>
       <w:bookmarkEnd w:id="4"/>
@@ -1328,7 +1945,7 @@
       <w:pPr>
         <w:pStyle w:val="Titre2"/>
       </w:pPr>
-      <w:bookmarkStart w:id="5" w:name="_Toc241241772"/>
+      <w:bookmarkStart w:id="5" w:name="_Toc244343718"/>
       <w:r>
         <w:t>U.S</w:t>
       </w:r>
@@ -1344,12 +1961,14 @@
       <w:pPr>
         <w:pStyle w:val="Titre3"/>
       </w:pPr>
+      <w:bookmarkStart w:id="6" w:name="_Toc244343719"/>
       <w:r>
         <w:t>En tant q</w:t>
       </w:r>
       <w:r>
         <w:t>ue joueur je veux être capable de me déplacer afin de pouvoir éviter les tirs ennemis.</w:t>
       </w:r>
+      <w:bookmarkEnd w:id="6"/>
     </w:p>
     <w:p>
       <w:pPr>
@@ -1414,7 +2033,6 @@
         </w:numPr>
       </w:pPr>
       <w:r>
-        <w:lastRenderedPageBreak/>
         <w:t>Si le joueur lâche les touches D ou →</w:t>
       </w:r>
       <w:r>
@@ -1457,9 +2075,11 @@
       <w:pPr>
         <w:pStyle w:val="Titre3"/>
       </w:pPr>
+      <w:bookmarkStart w:id="7" w:name="_Toc244343720"/>
       <w:r>
         <w:t>En tant que joueur je veux avoir 5 défenses afin de me protéger des tirs ennemis.</w:t>
       </w:r>
+      <w:bookmarkEnd w:id="7"/>
     </w:p>
     <w:p>
       <w:pPr>
@@ -1534,9 +2154,11 @@
       <w:pPr>
         <w:pStyle w:val="Titre3"/>
       </w:pPr>
+      <w:bookmarkStart w:id="8" w:name="_Toc244343721"/>
       <w:r>
         <w:t>En tant que joueur je veux tirer des noisettes afin de pouvoir éliminer l’ennemi.</w:t>
       </w:r>
+      <w:bookmarkEnd w:id="8"/>
     </w:p>
     <w:p>
       <w:pPr>
@@ -1588,6 +2210,7 @@
         </w:numPr>
       </w:pPr>
       <w:r>
+        <w:lastRenderedPageBreak/>
         <w:t>Si le joueur appuie à répétition sur la touche ESPACE alors il y aura un temps entre les noisettes qui tombe. Le joueur ne peut pas lâcher plusieurs noisettes à la fois.</w:t>
       </w:r>
     </w:p>
@@ -1624,10 +2247,7 @@
         </w:numPr>
       </w:pPr>
       <w:r>
-        <w:t>Lorsqu’un</w:t>
-      </w:r>
-      <w:r>
-        <w:t xml:space="preserve"> projectile touche un ennemi, le projectile se détruit.</w:t>
+        <w:t>Lorsqu’un projectile touche un ennemi, le projectile se détruit.</w:t>
       </w:r>
     </w:p>
     <w:p/>
@@ -1635,9 +2255,11 @@
       <w:pPr>
         <w:pStyle w:val="Titre3"/>
       </w:pPr>
+      <w:bookmarkStart w:id="9" w:name="_Toc244343722"/>
       <w:r>
         <w:t>En tant que développeur je veux avoir des ennemis afin d'avoir un jeu dynamique et jouable.</w:t>
       </w:r>
+      <w:bookmarkEnd w:id="9"/>
     </w:p>
     <w:p>
       <w:r>
@@ -1657,7 +2279,6 @@
         </w:numPr>
       </w:pPr>
       <w:r>
-        <w:lastRenderedPageBreak/>
         <w:t>L'ennemi de base : il se déplace et lance des projectiles sur le joueur.</w:t>
       </w:r>
     </w:p>
@@ -1768,12 +2389,22 @@
         <w:t xml:space="preserve"> il ne fait rien de spécial, l'ennemi continue </w:t>
       </w:r>
       <w:proofErr w:type="spellStart"/>
+      <w:proofErr w:type="gramStart"/>
       <w:r>
         <w:t>a</w:t>
       </w:r>
       <w:proofErr w:type="spellEnd"/>
-      <w:r>
-        <w:t xml:space="preserve"> faire sa tâches de base.</w:t>
+      <w:proofErr w:type="gramEnd"/>
+      <w:r>
+        <w:t xml:space="preserve"> faire </w:t>
+      </w:r>
+      <w:proofErr w:type="gramStart"/>
+      <w:r>
+        <w:t>sa tâches</w:t>
+      </w:r>
+      <w:proofErr w:type="gramEnd"/>
+      <w:r>
+        <w:t xml:space="preserve"> de base.</w:t>
       </w:r>
     </w:p>
     <w:p/>
@@ -1781,9 +2412,11 @@
       <w:pPr>
         <w:pStyle w:val="Titre3"/>
       </w:pPr>
+      <w:bookmarkStart w:id="10" w:name="_Toc244343723"/>
       <w:r>
         <w:t>En tant que joueur je veux voir mon score afficher afin de pouvoir suivre ma progression.</w:t>
       </w:r>
+      <w:bookmarkEnd w:id="10"/>
     </w:p>
     <w:p>
       <w:r>
@@ -1846,6 +2479,7 @@
     </w:p>
     <w:p>
       <w:r>
+        <w:lastRenderedPageBreak/>
         <w:t xml:space="preserve">Le score </w:t>
       </w:r>
       <w:proofErr w:type="gramStart"/>
@@ -1882,9 +2516,11 @@
       <w:pPr>
         <w:pStyle w:val="Titre3"/>
       </w:pPr>
+      <w:bookmarkStart w:id="11" w:name="_Toc244343724"/>
       <w:r>
         <w:t>En tant que joueur je veux gagner afin de terminer la partie.</w:t>
       </w:r>
+      <w:bookmarkEnd w:id="11"/>
     </w:p>
     <w:p>
       <w:r>
@@ -1932,10 +2568,11 @@
       <w:pPr>
         <w:pStyle w:val="Titre3"/>
       </w:pPr>
-      <w:r>
-        <w:lastRenderedPageBreak/>
+      <w:bookmarkStart w:id="12" w:name="_Toc244343725"/>
+      <w:r>
         <w:t>En tant que joueur je veux perdre afin de pouvoir terminer le jeu.</w:t>
       </w:r>
+      <w:bookmarkEnd w:id="12"/>
     </w:p>
     <w:p>
       <w:r>
@@ -1964,21 +2601,21 @@
       <w:pPr>
         <w:pStyle w:val="Titre1"/>
       </w:pPr>
-      <w:bookmarkStart w:id="6" w:name="_Toc241241773"/>
+      <w:bookmarkStart w:id="13" w:name="_Toc244343726"/>
       <w:r>
         <w:t>Planification</w:t>
       </w:r>
-      <w:bookmarkEnd w:id="6"/>
+      <w:bookmarkEnd w:id="13"/>
     </w:p>
     <w:p>
       <w:pPr>
         <w:pStyle w:val="Titre2"/>
       </w:pPr>
-      <w:bookmarkStart w:id="7" w:name="_Toc241241774"/>
+      <w:bookmarkStart w:id="14" w:name="_Toc244343727"/>
       <w:r>
         <w:t>Semaine 1</w:t>
       </w:r>
-      <w:bookmarkEnd w:id="7"/>
+      <w:bookmarkEnd w:id="14"/>
     </w:p>
     <w:p>
       <w:pPr>
@@ -2047,11 +2684,11 @@
       <w:pPr>
         <w:pStyle w:val="Titre2"/>
       </w:pPr>
-      <w:bookmarkStart w:id="8" w:name="_Toc241241775"/>
+      <w:bookmarkStart w:id="15" w:name="_Toc244343728"/>
       <w:r>
         <w:t>Semaine 2</w:t>
       </w:r>
-      <w:bookmarkEnd w:id="8"/>
+      <w:bookmarkEnd w:id="15"/>
     </w:p>
     <w:p>
       <w:pPr>
@@ -2102,11 +2739,11 @@
       <w:pPr>
         <w:pStyle w:val="Titre2"/>
       </w:pPr>
-      <w:bookmarkStart w:id="9" w:name="_Toc241241776"/>
+      <w:bookmarkStart w:id="16" w:name="_Toc244343729"/>
       <w:r>
         <w:t>Semaine 3</w:t>
       </w:r>
-      <w:bookmarkEnd w:id="9"/>
+      <w:bookmarkEnd w:id="16"/>
     </w:p>
     <w:p>
       <w:pPr>
@@ -2137,6 +2774,7 @@
         </w:numPr>
       </w:pPr>
       <w:r>
+        <w:lastRenderedPageBreak/>
         <w:t>Commencer la US sur les déplacements du Joueur.</w:t>
       </w:r>
     </w:p>
@@ -2144,11 +2782,11 @@
       <w:pPr>
         <w:pStyle w:val="Titre2"/>
       </w:pPr>
-      <w:bookmarkStart w:id="10" w:name="_Toc241241777"/>
+      <w:bookmarkStart w:id="17" w:name="_Toc244343730"/>
       <w:r>
         <w:t>Semaine 4</w:t>
       </w:r>
-      <w:bookmarkEnd w:id="10"/>
+      <w:bookmarkEnd w:id="17"/>
     </w:p>
     <w:p>
       <w:pPr>
@@ -2178,11 +2816,11 @@
       <w:pPr>
         <w:pStyle w:val="Titre2"/>
       </w:pPr>
-      <w:bookmarkStart w:id="11" w:name="_Toc241241778"/>
+      <w:bookmarkStart w:id="18" w:name="_Toc244343731"/>
       <w:r>
         <w:t>Semaine 5</w:t>
       </w:r>
-      <w:bookmarkEnd w:id="11"/>
+      <w:bookmarkEnd w:id="18"/>
     </w:p>
     <w:p>
       <w:pPr>
@@ -2206,11 +2844,11 @@
       <w:pPr>
         <w:pStyle w:val="Titre2"/>
       </w:pPr>
-      <w:bookmarkStart w:id="12" w:name="_Toc241241779"/>
+      <w:bookmarkStart w:id="19" w:name="_Toc244343732"/>
       <w:r>
         <w:t>Semaine 6</w:t>
       </w:r>
-      <w:bookmarkEnd w:id="12"/>
+      <w:bookmarkEnd w:id="19"/>
     </w:p>
     <w:p>
       <w:pPr>
@@ -2249,13 +2887,12 @@
           <w:lang w:val="en-US"/>
         </w:rPr>
       </w:pPr>
-      <w:bookmarkStart w:id="13" w:name="_Toc241241780"/>
+      <w:bookmarkStart w:id="20" w:name="_Toc244343733"/>
       <w:proofErr w:type="spellStart"/>
       <w:r>
         <w:rPr>
           <w:lang w:val="en-US"/>
         </w:rPr>
-        <w:lastRenderedPageBreak/>
         <w:t>Semaine</w:t>
       </w:r>
       <w:proofErr w:type="spellEnd"/>
@@ -2265,7 +2902,7 @@
         </w:rPr>
         <w:t xml:space="preserve"> 7</w:t>
       </w:r>
-      <w:bookmarkEnd w:id="13"/>
+      <w:bookmarkEnd w:id="20"/>
     </w:p>
     <w:p>
       <w:pPr>
@@ -2316,7 +2953,7 @@
           <w:lang w:val="en-US"/>
         </w:rPr>
       </w:pPr>
-      <w:bookmarkStart w:id="14" w:name="_Toc241241781"/>
+      <w:bookmarkStart w:id="21" w:name="_Toc244343734"/>
       <w:proofErr w:type="spellStart"/>
       <w:r>
         <w:rPr>
@@ -2331,7 +2968,7 @@
         </w:rPr>
         <w:t xml:space="preserve"> 8</w:t>
       </w:r>
-      <w:bookmarkEnd w:id="14"/>
+      <w:bookmarkEnd w:id="21"/>
     </w:p>
     <w:p>
       <w:pPr>
@@ -2351,7 +2988,172 @@
         <w:t>, ajout de pouvoir pour le joueur (lancer plus de projectile, plus de vie, plus de vitesse).</w:t>
       </w:r>
     </w:p>
+    <w:p>
+      <w:pPr>
+        <w:pStyle w:val="Titre1"/>
+      </w:pPr>
+      <w:bookmarkStart w:id="22" w:name="_Toc244343735"/>
+      <w:r>
+        <w:t>Tests Unitaires</w:t>
+      </w:r>
+      <w:bookmarkEnd w:id="22"/>
+    </w:p>
+    <w:p>
+      <w:r>
+        <w:t>Outil</w:t>
+      </w:r>
+      <w:r>
+        <w:rPr>
+          <w:b/>
+          <w:bCs/>
+        </w:rPr>
+        <w:t xml:space="preserve"> :</w:t>
+      </w:r>
+      <w:r>
+        <w:t xml:space="preserve"> </w:t>
+      </w:r>
+      <w:proofErr w:type="spellStart"/>
+      <w:r>
+        <w:t>MSTest</w:t>
+      </w:r>
+      <w:proofErr w:type="spellEnd"/>
+      <w:r>
+        <w:t xml:space="preserve"> (v3.1.1, .NET 8 Windows), schéma AAA (</w:t>
+      </w:r>
+      <w:r>
+        <w:rPr>
+          <w:i/>
+          <w:iCs/>
+        </w:rPr>
+        <w:t>Arrange/</w:t>
+      </w:r>
+      <w:proofErr w:type="spellStart"/>
+      <w:r>
+        <w:rPr>
+          <w:i/>
+          <w:iCs/>
+        </w:rPr>
+        <w:t>Act</w:t>
+      </w:r>
+      <w:proofErr w:type="spellEnd"/>
+      <w:r>
+        <w:rPr>
+          <w:i/>
+          <w:iCs/>
+        </w:rPr>
+        <w:t>/</w:t>
+      </w:r>
+      <w:proofErr w:type="spellStart"/>
+      <w:r>
+        <w:rPr>
+          <w:i/>
+          <w:iCs/>
+        </w:rPr>
+        <w:t>Assert</w:t>
+      </w:r>
+      <w:proofErr w:type="spellEnd"/>
+      <w:r>
+        <w:t xml:space="preserve">). </w:t>
+      </w:r>
+    </w:p>
+    <w:p>
+      <w:r>
+        <w:t xml:space="preserve">Correctifs </w:t>
+      </w:r>
+      <w:r>
+        <w:rPr>
+          <w:b/>
+          <w:bCs/>
+        </w:rPr>
+        <w:t>:</w:t>
+      </w:r>
+      <w:r>
+        <w:t xml:space="preserve"> </w:t>
+      </w:r>
+      <w:r>
+        <w:t>Mettre le</w:t>
+      </w:r>
+      <w:r>
+        <w:t xml:space="preserve"> projet de test en net8.0-windows + ajout de la </w:t>
+      </w:r>
+      <w:r>
+        <w:t>référence.</w:t>
+      </w:r>
+    </w:p>
+    <w:p>
+      <w:r>
+        <w:t>Déplacements A/D/Flèches</w:t>
+      </w:r>
+      <w:r>
+        <w:t xml:space="preserve">, </w:t>
+      </w:r>
+      <w:r>
+        <w:t>collisions noisette/ennemi et tir/joueur traversée des feuilles par les noisettes, destruction des feuilles par tirs ennemis</w:t>
+      </w:r>
+      <w:r>
+        <w:t>,</w:t>
+      </w:r>
+      <w:r>
+        <w:t xml:space="preserve"> condition de victoire et reset au restart.</w:t>
+      </w:r>
+    </w:p>
+    <w:p>
+      <w:r>
+        <w:t>Les Test unitaires nous permettent de savoir si notre programme ne fonctionne bien pas que visuellement au lancement du jeu, ils nous permettent de régler des problèmes si certains tests ne fonctionnent pas.</w:t>
+      </w:r>
+    </w:p>
     <w:p/>
+    <w:p>
+      <w:pPr>
+        <w:pStyle w:val="Titre1"/>
+      </w:pPr>
+      <w:bookmarkStart w:id="23" w:name="_Toc244343736"/>
+      <w:r>
+        <w:t>Utilisation de l’IA</w:t>
+      </w:r>
+      <w:bookmarkEnd w:id="23"/>
+    </w:p>
+    <w:p>
+      <w:r>
+        <w:t xml:space="preserve">L’IA à été utilisée le moins possible, souvent dans des cas ou je ne trouvais pas de solution, après en avoir parler avec le prof vendredi j’ai pris conscience de mon </w:t>
+      </w:r>
+      <w:r>
+        <w:lastRenderedPageBreak/>
+        <w:t xml:space="preserve">utilisation de l’IA et à la fin du projet </w:t>
+      </w:r>
+      <w:proofErr w:type="gramStart"/>
+      <w:r>
+        <w:t>j’ai été</w:t>
+      </w:r>
+      <w:proofErr w:type="gramEnd"/>
+      <w:r>
+        <w:t xml:space="preserve"> directement lui demander s’il y avait des parties bizarres surement faites par elle, des bouts de code assez futés </w:t>
+      </w:r>
+      <w:proofErr w:type="spellStart"/>
+      <w:r>
+        <w:t>etc</w:t>
+      </w:r>
+      <w:proofErr w:type="spellEnd"/>
+      <w:r>
+        <w:t xml:space="preserve"> etc. Puis en ayant vu ces bouts de codes je les ai modifiés avec ce qu’on a appris en cours, c’est-à-dire avec des boucles for/</w:t>
+      </w:r>
+      <w:proofErr w:type="spellStart"/>
+      <w:r>
+        <w:t>foreach</w:t>
+      </w:r>
+      <w:proofErr w:type="spellEnd"/>
+      <w:r>
+        <w:t xml:space="preserve"> </w:t>
+      </w:r>
+      <w:proofErr w:type="spellStart"/>
+      <w:r>
+        <w:t>etc</w:t>
+      </w:r>
+      <w:proofErr w:type="spellEnd"/>
+      <w:r>
+        <w:t xml:space="preserve"> etc.</w:t>
+      </w:r>
+    </w:p>
     <w:sectPr>
       <w:pgSz w:w="11906" w:h="16838"/>
       <w:pgMar w:top="1417" w:right="1417" w:bottom="1417" w:left="1417" w:header="708" w:footer="708" w:gutter="0"/>
@@ -2925,6 +3727,155 @@
     </w:lvl>
   </w:abstractNum>
   <w:abstractNum w:abstractNumId="4" w15:restartNumberingAfterBreak="0">
+    <w:nsid w:val="50023507"/>
+    <w:multiLevelType w:val="multilevel"/>
+    <w:tmpl w:val="F454CDE0"/>
+    <w:lvl w:ilvl="0">
+      <w:start w:val="1"/>
+      <w:numFmt w:val="bullet"/>
+      <w:lvlText w:val=""/>
+      <w:lvlJc w:val="left"/>
+      <w:pPr>
+        <w:tabs>
+          <w:tab w:val="num" w:pos="720"/>
+        </w:tabs>
+        <w:ind w:left="720" w:hanging="360"/>
+      </w:pPr>
+      <w:rPr>
+        <w:rFonts w:ascii="Symbol" w:hAnsi="Symbol" w:hint="default"/>
+        <w:sz w:val="20"/>
+      </w:rPr>
+    </w:lvl>
+    <w:lvl w:ilvl="1" w:tentative="1">
+      <w:start w:val="1"/>
+      <w:numFmt w:val="bullet"/>
+      <w:lvlText w:val="o"/>
+      <w:lvlJc w:val="left"/>
+      <w:pPr>
+        <w:tabs>
+          <w:tab w:val="num" w:pos="1440"/>
+        </w:tabs>
+        <w:ind w:left="1440" w:hanging="360"/>
+      </w:pPr>
+      <w:rPr>
+        <w:rFonts w:ascii="Courier New" w:hAnsi="Courier New" w:hint="default"/>
+        <w:sz w:val="20"/>
+      </w:rPr>
+    </w:lvl>
+    <w:lvl w:ilvl="2" w:tentative="1">
+      <w:start w:val="1"/>
+      <w:numFmt w:val="bullet"/>
+      <w:lvlText w:val=""/>
+      <w:lvlJc w:val="left"/>
+      <w:pPr>
+        <w:tabs>
+          <w:tab w:val="num" w:pos="2160"/>
+        </w:tabs>
+        <w:ind w:left="2160" w:hanging="360"/>
+      </w:pPr>
+      <w:rPr>
+        <w:rFonts w:ascii="Wingdings" w:hAnsi="Wingdings" w:hint="default"/>
+        <w:sz w:val="20"/>
+      </w:rPr>
+    </w:lvl>
+    <w:lvl w:ilvl="3" w:tentative="1">
+      <w:start w:val="1"/>
+      <w:numFmt w:val="bullet"/>
+      <w:lvlText w:val=""/>
+      <w:lvlJc w:val="left"/>
+      <w:pPr>
+        <w:tabs>
+          <w:tab w:val="num" w:pos="2880"/>
+        </w:tabs>
+        <w:ind w:left="2880" w:hanging="360"/>
+      </w:pPr>
+      <w:rPr>
+        <w:rFonts w:ascii="Wingdings" w:hAnsi="Wingdings" w:hint="default"/>
+        <w:sz w:val="20"/>
+      </w:rPr>
+    </w:lvl>
+    <w:lvl w:ilvl="4" w:tentative="1">
+      <w:start w:val="1"/>
+      <w:numFmt w:val="bullet"/>
+      <w:lvlText w:val=""/>
+      <w:lvlJc w:val="left"/>
+      <w:pPr>
+        <w:tabs>
+          <w:tab w:val="num" w:pos="3600"/>
+        </w:tabs>
+        <w:ind w:left="3600" w:hanging="360"/>
+      </w:pPr>
+      <w:rPr>
+        <w:rFonts w:ascii="Wingdings" w:hAnsi="Wingdings" w:hint="default"/>
+        <w:sz w:val="20"/>
+      </w:rPr>
+    </w:lvl>
+    <w:lvl w:ilvl="5" w:tentative="1">
+      <w:start w:val="1"/>
+      <w:numFmt w:val="bullet"/>
+      <w:lvlText w:val=""/>
+      <w:lvlJc w:val="left"/>
+      <w:pPr>
+        <w:tabs>
+          <w:tab w:val="num" w:pos="4320"/>
+        </w:tabs>
+        <w:ind w:left="4320" w:hanging="360"/>
+      </w:pPr>
+      <w:rPr>
+        <w:rFonts w:ascii="Wingdings" w:hAnsi="Wingdings" w:hint="default"/>
+        <w:sz w:val="20"/>
+      </w:rPr>
+    </w:lvl>
+    <w:lvl w:ilvl="6" w:tentative="1">
+      <w:start w:val="1"/>
+      <w:numFmt w:val="bullet"/>
+      <w:lvlText w:val=""/>
+      <w:lvlJc w:val="left"/>
+      <w:pPr>
+        <w:tabs>
+          <w:tab w:val="num" w:pos="5040"/>
+        </w:tabs>
+        <w:ind w:left="5040" w:hanging="360"/>
+      </w:pPr>
+      <w:rPr>
+        <w:rFonts w:ascii="Wingdings" w:hAnsi="Wingdings" w:hint="default"/>
+        <w:sz w:val="20"/>
+      </w:rPr>
+    </w:lvl>
+    <w:lvl w:ilvl="7" w:tentative="1">
+      <w:start w:val="1"/>
+      <w:numFmt w:val="bullet"/>
+      <w:lvlText w:val=""/>
+      <w:lvlJc w:val="left"/>
+      <w:pPr>
+        <w:tabs>
+          <w:tab w:val="num" w:pos="5760"/>
+        </w:tabs>
+        <w:ind w:left="5760" w:hanging="360"/>
+      </w:pPr>
+      <w:rPr>
+        <w:rFonts w:ascii="Wingdings" w:hAnsi="Wingdings" w:hint="default"/>
+        <w:sz w:val="20"/>
+      </w:rPr>
+    </w:lvl>
+    <w:lvl w:ilvl="8" w:tentative="1">
+      <w:start w:val="1"/>
+      <w:numFmt w:val="bullet"/>
+      <w:lvlText w:val=""/>
+      <w:lvlJc w:val="left"/>
+      <w:pPr>
+        <w:tabs>
+          <w:tab w:val="num" w:pos="6480"/>
+        </w:tabs>
+        <w:ind w:left="6480" w:hanging="360"/>
+      </w:pPr>
+      <w:rPr>
+        <w:rFonts w:ascii="Wingdings" w:hAnsi="Wingdings" w:hint="default"/>
+        <w:sz w:val="20"/>
+      </w:rPr>
+    </w:lvl>
+  </w:abstractNum>
+  <w:abstractNum w:abstractNumId="5" w15:restartNumberingAfterBreak="0">
     <w:nsid w:val="51ED4751"/>
     <w:multiLevelType w:val="multilevel"/>
     <w:tmpl w:val="7966C356"/>
@@ -3073,7 +4024,7 @@
       </w:rPr>
     </w:lvl>
   </w:abstractNum>
-  <w:abstractNum w:abstractNumId="5" w15:restartNumberingAfterBreak="0">
+  <w:abstractNum w:abstractNumId="6" w15:restartNumberingAfterBreak="0">
     <w:nsid w:val="52B70BAA"/>
     <w:multiLevelType w:val="hybridMultilevel"/>
     <w:tmpl w:val="2D1A8536"/>
@@ -3186,7 +4137,156 @@
       </w:rPr>
     </w:lvl>
   </w:abstractNum>
-  <w:abstractNum w:abstractNumId="6" w15:restartNumberingAfterBreak="0">
+  <w:abstractNum w:abstractNumId="7" w15:restartNumberingAfterBreak="0">
+    <w:nsid w:val="587D70ED"/>
+    <w:multiLevelType w:val="multilevel"/>
+    <w:tmpl w:val="2C1A5814"/>
+    <w:lvl w:ilvl="0">
+      <w:start w:val="1"/>
+      <w:numFmt w:val="bullet"/>
+      <w:lvlText w:val=""/>
+      <w:lvlJc w:val="left"/>
+      <w:pPr>
+        <w:tabs>
+          <w:tab w:val="num" w:pos="720"/>
+        </w:tabs>
+        <w:ind w:left="720" w:hanging="360"/>
+      </w:pPr>
+      <w:rPr>
+        <w:rFonts w:ascii="Symbol" w:hAnsi="Symbol" w:hint="default"/>
+        <w:sz w:val="20"/>
+      </w:rPr>
+    </w:lvl>
+    <w:lvl w:ilvl="1" w:tentative="1">
+      <w:start w:val="1"/>
+      <w:numFmt w:val="bullet"/>
+      <w:lvlText w:val="o"/>
+      <w:lvlJc w:val="left"/>
+      <w:pPr>
+        <w:tabs>
+          <w:tab w:val="num" w:pos="1440"/>
+        </w:tabs>
+        <w:ind w:left="1440" w:hanging="360"/>
+      </w:pPr>
+      <w:rPr>
+        <w:rFonts w:ascii="Courier New" w:hAnsi="Courier New" w:hint="default"/>
+        <w:sz w:val="20"/>
+      </w:rPr>
+    </w:lvl>
+    <w:lvl w:ilvl="2" w:tentative="1">
+      <w:start w:val="1"/>
+      <w:numFmt w:val="bullet"/>
+      <w:lvlText w:val=""/>
+      <w:lvlJc w:val="left"/>
+      <w:pPr>
+        <w:tabs>
+          <w:tab w:val="num" w:pos="2160"/>
+        </w:tabs>
+        <w:ind w:left="2160" w:hanging="360"/>
+      </w:pPr>
+      <w:rPr>
+        <w:rFonts w:ascii="Wingdings" w:hAnsi="Wingdings" w:hint="default"/>
+        <w:sz w:val="20"/>
+      </w:rPr>
+    </w:lvl>
+    <w:lvl w:ilvl="3" w:tentative="1">
+      <w:start w:val="1"/>
+      <w:numFmt w:val="bullet"/>
+      <w:lvlText w:val=""/>
+      <w:lvlJc w:val="left"/>
+      <w:pPr>
+        <w:tabs>
+          <w:tab w:val="num" w:pos="2880"/>
+        </w:tabs>
+        <w:ind w:left="2880" w:hanging="360"/>
+      </w:pPr>
+      <w:rPr>
+        <w:rFonts w:ascii="Wingdings" w:hAnsi="Wingdings" w:hint="default"/>
+        <w:sz w:val="20"/>
+      </w:rPr>
+    </w:lvl>
+    <w:lvl w:ilvl="4" w:tentative="1">
+      <w:start w:val="1"/>
+      <w:numFmt w:val="bullet"/>
+      <w:lvlText w:val=""/>
+      <w:lvlJc w:val="left"/>
+      <w:pPr>
+        <w:tabs>
+          <w:tab w:val="num" w:pos="3600"/>
+        </w:tabs>
+        <w:ind w:left="3600" w:hanging="360"/>
+      </w:pPr>
+      <w:rPr>
+        <w:rFonts w:ascii="Wingdings" w:hAnsi="Wingdings" w:hint="default"/>
+        <w:sz w:val="20"/>
+      </w:rPr>
+    </w:lvl>
+    <w:lvl w:ilvl="5" w:tentative="1">
+      <w:start w:val="1"/>
+      <w:numFmt w:val="bullet"/>
+      <w:lvlText w:val=""/>
+      <w:lvlJc w:val="left"/>
+      <w:pPr>
+        <w:tabs>
+          <w:tab w:val="num" w:pos="4320"/>
+        </w:tabs>
+        <w:ind w:left="4320" w:hanging="360"/>
+      </w:pPr>
+      <w:rPr>
+        <w:rFonts w:ascii="Wingdings" w:hAnsi="Wingdings" w:hint="default"/>
+        <w:sz w:val="20"/>
+      </w:rPr>
+    </w:lvl>
+    <w:lvl w:ilvl="6" w:tentative="1">
+      <w:start w:val="1"/>
+      <w:numFmt w:val="bullet"/>
+      <w:lvlText w:val=""/>
+      <w:lvlJc w:val="left"/>
+      <w:pPr>
+        <w:tabs>
+          <w:tab w:val="num" w:pos="5040"/>
+        </w:tabs>
+        <w:ind w:left="5040" w:hanging="360"/>
+      </w:pPr>
+      <w:rPr>
+        <w:rFonts w:ascii="Wingdings" w:hAnsi="Wingdings" w:hint="default"/>
+        <w:sz w:val="20"/>
+      </w:rPr>
+    </w:lvl>
+    <w:lvl w:ilvl="7" w:tentative="1">
+      <w:start w:val="1"/>
+      <w:numFmt w:val="bullet"/>
+      <w:lvlText w:val=""/>
+      <w:lvlJc w:val="left"/>
+      <w:pPr>
+        <w:tabs>
+          <w:tab w:val="num" w:pos="5760"/>
+        </w:tabs>
+        <w:ind w:left="5760" w:hanging="360"/>
+      </w:pPr>
+      <w:rPr>
+        <w:rFonts w:ascii="Wingdings" w:hAnsi="Wingdings" w:hint="default"/>
+        <w:sz w:val="20"/>
+      </w:rPr>
+    </w:lvl>
+    <w:lvl w:ilvl="8" w:tentative="1">
+      <w:start w:val="1"/>
+      <w:numFmt w:val="bullet"/>
+      <w:lvlText w:val=""/>
+      <w:lvlJc w:val="left"/>
+      <w:pPr>
+        <w:tabs>
+          <w:tab w:val="num" w:pos="6480"/>
+        </w:tabs>
+        <w:ind w:left="6480" w:hanging="360"/>
+      </w:pPr>
+      <w:rPr>
+        <w:rFonts w:ascii="Wingdings" w:hAnsi="Wingdings" w:hint="default"/>
+        <w:sz w:val="20"/>
+      </w:rPr>
+    </w:lvl>
+  </w:abstractNum>
+  <w:abstractNum w:abstractNumId="8" w15:restartNumberingAfterBreak="0">
     <w:nsid w:val="64820E05"/>
     <w:multiLevelType w:val="multilevel"/>
     <w:tmpl w:val="08866358"/>
@@ -3335,8 +4435,157 @@
       </w:rPr>
     </w:lvl>
   </w:abstractNum>
+  <w:abstractNum w:abstractNumId="9" w15:restartNumberingAfterBreak="0">
+    <w:nsid w:val="68C22F3C"/>
+    <w:multiLevelType w:val="multilevel"/>
+    <w:tmpl w:val="7856EADA"/>
+    <w:lvl w:ilvl="0">
+      <w:start w:val="1"/>
+      <w:numFmt w:val="bullet"/>
+      <w:lvlText w:val=""/>
+      <w:lvlJc w:val="left"/>
+      <w:pPr>
+        <w:tabs>
+          <w:tab w:val="num" w:pos="720"/>
+        </w:tabs>
+        <w:ind w:left="720" w:hanging="360"/>
+      </w:pPr>
+      <w:rPr>
+        <w:rFonts w:ascii="Symbol" w:hAnsi="Symbol" w:hint="default"/>
+        <w:sz w:val="20"/>
+      </w:rPr>
+    </w:lvl>
+    <w:lvl w:ilvl="1" w:tentative="1">
+      <w:start w:val="1"/>
+      <w:numFmt w:val="bullet"/>
+      <w:lvlText w:val="o"/>
+      <w:lvlJc w:val="left"/>
+      <w:pPr>
+        <w:tabs>
+          <w:tab w:val="num" w:pos="1440"/>
+        </w:tabs>
+        <w:ind w:left="1440" w:hanging="360"/>
+      </w:pPr>
+      <w:rPr>
+        <w:rFonts w:ascii="Courier New" w:hAnsi="Courier New" w:hint="default"/>
+        <w:sz w:val="20"/>
+      </w:rPr>
+    </w:lvl>
+    <w:lvl w:ilvl="2" w:tentative="1">
+      <w:start w:val="1"/>
+      <w:numFmt w:val="bullet"/>
+      <w:lvlText w:val=""/>
+      <w:lvlJc w:val="left"/>
+      <w:pPr>
+        <w:tabs>
+          <w:tab w:val="num" w:pos="2160"/>
+        </w:tabs>
+        <w:ind w:left="2160" w:hanging="360"/>
+      </w:pPr>
+      <w:rPr>
+        <w:rFonts w:ascii="Wingdings" w:hAnsi="Wingdings" w:hint="default"/>
+        <w:sz w:val="20"/>
+      </w:rPr>
+    </w:lvl>
+    <w:lvl w:ilvl="3" w:tentative="1">
+      <w:start w:val="1"/>
+      <w:numFmt w:val="bullet"/>
+      <w:lvlText w:val=""/>
+      <w:lvlJc w:val="left"/>
+      <w:pPr>
+        <w:tabs>
+          <w:tab w:val="num" w:pos="2880"/>
+        </w:tabs>
+        <w:ind w:left="2880" w:hanging="360"/>
+      </w:pPr>
+      <w:rPr>
+        <w:rFonts w:ascii="Wingdings" w:hAnsi="Wingdings" w:hint="default"/>
+        <w:sz w:val="20"/>
+      </w:rPr>
+    </w:lvl>
+    <w:lvl w:ilvl="4" w:tentative="1">
+      <w:start w:val="1"/>
+      <w:numFmt w:val="bullet"/>
+      <w:lvlText w:val=""/>
+      <w:lvlJc w:val="left"/>
+      <w:pPr>
+        <w:tabs>
+          <w:tab w:val="num" w:pos="3600"/>
+        </w:tabs>
+        <w:ind w:left="3600" w:hanging="360"/>
+      </w:pPr>
+      <w:rPr>
+        <w:rFonts w:ascii="Wingdings" w:hAnsi="Wingdings" w:hint="default"/>
+        <w:sz w:val="20"/>
+      </w:rPr>
+    </w:lvl>
+    <w:lvl w:ilvl="5" w:tentative="1">
+      <w:start w:val="1"/>
+      <w:numFmt w:val="bullet"/>
+      <w:lvlText w:val=""/>
+      <w:lvlJc w:val="left"/>
+      <w:pPr>
+        <w:tabs>
+          <w:tab w:val="num" w:pos="4320"/>
+        </w:tabs>
+        <w:ind w:left="4320" w:hanging="360"/>
+      </w:pPr>
+      <w:rPr>
+        <w:rFonts w:ascii="Wingdings" w:hAnsi="Wingdings" w:hint="default"/>
+        <w:sz w:val="20"/>
+      </w:rPr>
+    </w:lvl>
+    <w:lvl w:ilvl="6" w:tentative="1">
+      <w:start w:val="1"/>
+      <w:numFmt w:val="bullet"/>
+      <w:lvlText w:val=""/>
+      <w:lvlJc w:val="left"/>
+      <w:pPr>
+        <w:tabs>
+          <w:tab w:val="num" w:pos="5040"/>
+        </w:tabs>
+        <w:ind w:left="5040" w:hanging="360"/>
+      </w:pPr>
+      <w:rPr>
+        <w:rFonts w:ascii="Wingdings" w:hAnsi="Wingdings" w:hint="default"/>
+        <w:sz w:val="20"/>
+      </w:rPr>
+    </w:lvl>
+    <w:lvl w:ilvl="7" w:tentative="1">
+      <w:start w:val="1"/>
+      <w:numFmt w:val="bullet"/>
+      <w:lvlText w:val=""/>
+      <w:lvlJc w:val="left"/>
+      <w:pPr>
+        <w:tabs>
+          <w:tab w:val="num" w:pos="5760"/>
+        </w:tabs>
+        <w:ind w:left="5760" w:hanging="360"/>
+      </w:pPr>
+      <w:rPr>
+        <w:rFonts w:ascii="Wingdings" w:hAnsi="Wingdings" w:hint="default"/>
+        <w:sz w:val="20"/>
+      </w:rPr>
+    </w:lvl>
+    <w:lvl w:ilvl="8" w:tentative="1">
+      <w:start w:val="1"/>
+      <w:numFmt w:val="bullet"/>
+      <w:lvlText w:val=""/>
+      <w:lvlJc w:val="left"/>
+      <w:pPr>
+        <w:tabs>
+          <w:tab w:val="num" w:pos="6480"/>
+        </w:tabs>
+        <w:ind w:left="6480" w:hanging="360"/>
+      </w:pPr>
+      <w:rPr>
+        <w:rFonts w:ascii="Wingdings" w:hAnsi="Wingdings" w:hint="default"/>
+        <w:sz w:val="20"/>
+      </w:rPr>
+    </w:lvl>
+  </w:abstractNum>
   <w:num w:numId="1" w16cid:durableId="1110512071">
-    <w:abstractNumId w:val="5"/>
+    <w:abstractNumId w:val="6"/>
   </w:num>
   <w:num w:numId="2" w16cid:durableId="1153988084">
     <w:abstractNumId w:val="1"/>
@@ -3348,13 +4597,22 @@
     <w:abstractNumId w:val="2"/>
   </w:num>
   <w:num w:numId="5" w16cid:durableId="1635715025">
-    <w:abstractNumId w:val="6"/>
+    <w:abstractNumId w:val="8"/>
   </w:num>
   <w:num w:numId="6" w16cid:durableId="705371451">
     <w:abstractNumId w:val="0"/>
   </w:num>
   <w:num w:numId="7" w16cid:durableId="740710812">
+    <w:abstractNumId w:val="5"/>
+  </w:num>
+  <w:num w:numId="8" w16cid:durableId="1578828172">
     <w:abstractNumId w:val="4"/>
+  </w:num>
+  <w:num w:numId="9" w16cid:durableId="779842149">
+    <w:abstractNumId w:val="7"/>
+  </w:num>
+  <w:num w:numId="10" w16cid:durableId="876166205">
+    <w:abstractNumId w:val="9"/>
   </w:num>
 </w:numbering>
 </file>
@@ -4327,6 +5585,19 @@
       <w:ind w:left="240"/>
     </w:pPr>
   </w:style>
+  <w:style w:type="paragraph" w:styleId="TM3">
+    <w:name w:val="toc 3"/>
+    <w:basedOn w:val="Normal"/>
+    <w:next w:val="Normal"/>
+    <w:autoRedefine/>
+    <w:uiPriority w:val="39"/>
+    <w:unhideWhenUsed/>
+    <w:rsid w:val="00087028"/>
+    <w:pPr>
+      <w:spacing w:after="100"/>
+      <w:ind w:left="480"/>
+    </w:pPr>
+  </w:style>
 </w:styles>
 </file>
 
@@ -4646,10 +5917,23 @@
 </file>
 
 <file path=customXml/item1.xml><?xml version="1.0" encoding="utf-8"?>
-<b:Sources xmlns:b="http://schemas.openxmlformats.org/officeDocument/2006/bibliography" xmlns="http://schemas.openxmlformats.org/officeDocument/2006/bibliography" SelectedStyle="\APASixthEditionOfficeOnline.xsl" StyleName="APA" Version="6"/>
+<p:properties xmlns:p="http://schemas.microsoft.com/office/2006/metadata/properties" xmlns:xsi="http://www.w3.org/2001/XMLSchema-instance" xmlns:pc="http://schemas.microsoft.com/office/infopath/2007/PartnerControls">
+  <documentManagement>
+    <_activity xmlns="6cf9629a-3f6c-4f5f-bf5a-9990f6d83c58" xsi:nil="true"/>
+  </documentManagement>
+</p:properties>
 </file>
 
 <file path=customXml/item2.xml><?xml version="1.0" encoding="utf-8"?>
+<?mso-contentType ?>
+<FormTemplates xmlns="http://schemas.microsoft.com/sharepoint/v3/contenttype/forms">
+  <Display>DocumentLibraryForm</Display>
+  <Edit>DocumentLibraryForm</Edit>
+  <New>DocumentLibraryForm</New>
+</FormTemplates>
+</file>
+
+<file path=customXml/item3.xml><?xml version="1.0" encoding="utf-8"?>
 <ct:contentTypeSchema xmlns:ct="http://schemas.microsoft.com/office/2006/metadata/contentType" xmlns:ma="http://schemas.microsoft.com/office/2006/metadata/properties/metaAttributes" ct:_="" ma:_="" ma:contentTypeName="Document" ma:contentTypeID="0x0101008A44E17421B74B4385ED2944255AEAB1" ma:contentTypeVersion="15" ma:contentTypeDescription="Crée un document." ma:contentTypeScope="" ma:versionID="93b5b18248b291ae417a942065f70d11">
   <xsd:schema xmlns:xsd="http://www.w3.org/2001/XMLSchema" xmlns:xs="http://www.w3.org/2001/XMLSchema" xmlns:p="http://schemas.microsoft.com/office/2006/metadata/properties" xmlns:ns3="6cf9629a-3f6c-4f5f-bf5a-9990f6d83c58" xmlns:ns4="ef367ba7-2429-4e09-a0d8-fa435a6b45cb" targetNamespace="http://schemas.microsoft.com/office/2006/metadata/properties" ma:root="true" ma:fieldsID="eb702e15d063576a5a91b0ad2108833a" ns3:_="" ns4:_="">
     <xsd:import namespace="6cf9629a-3f6c-4f5f-bf5a-9990f6d83c58"/>
@@ -4882,32 +6166,29 @@
 </ct:contentTypeSchema>
 </file>
 
-<file path=customXml/item3.xml><?xml version="1.0" encoding="utf-8"?>
-<?mso-contentType ?>
-<FormTemplates xmlns="http://schemas.microsoft.com/sharepoint/v3/contenttype/forms">
-  <Display>DocumentLibraryForm</Display>
-  <Edit>DocumentLibraryForm</Edit>
-  <New>DocumentLibraryForm</New>
-</FormTemplates>
-</file>
-
 <file path=customXml/item4.xml><?xml version="1.0" encoding="utf-8"?>
-<p:properties xmlns:p="http://schemas.microsoft.com/office/2006/metadata/properties" xmlns:xsi="http://www.w3.org/2001/XMLSchema-instance" xmlns:pc="http://schemas.microsoft.com/office/infopath/2007/PartnerControls">
-  <documentManagement>
-    <_activity xmlns="6cf9629a-3f6c-4f5f-bf5a-9990f6d83c58" xsi:nil="true"/>
-  </documentManagement>
-</p:properties>
+<b:Sources xmlns:b="http://schemas.openxmlformats.org/officeDocument/2006/bibliography" xmlns="http://schemas.openxmlformats.org/officeDocument/2006/bibliography" SelectedStyle="\APASixthEditionOfficeOnline.xsl" StyleName="APA" Version="6"/>
 </file>
 
 <file path=customXml/itemProps1.xml><?xml version="1.0" encoding="utf-8"?>
-<ds:datastoreItem xmlns:ds="http://schemas.openxmlformats.org/officeDocument/2006/customXml" ds:itemID="{2C53BA18-DBA6-435B-B859-AC3BE7A8B3B8}">
+<ds:datastoreItem xmlns:ds="http://schemas.openxmlformats.org/officeDocument/2006/customXml" ds:itemID="{FC71E993-84B4-48D2-950C-13C131ED85B2}">
   <ds:schemaRefs>
-    <ds:schemaRef ds:uri="http://schemas.openxmlformats.org/officeDocument/2006/bibliography"/>
+    <ds:schemaRef ds:uri="http://schemas.microsoft.com/office/2006/metadata/properties"/>
+    <ds:schemaRef ds:uri="http://schemas.microsoft.com/office/infopath/2007/PartnerControls"/>
+    <ds:schemaRef ds:uri="6cf9629a-3f6c-4f5f-bf5a-9990f6d83c58"/>
   </ds:schemaRefs>
 </ds:datastoreItem>
 </file>
 
 <file path=customXml/itemProps2.xml><?xml version="1.0" encoding="utf-8"?>
+<ds:datastoreItem xmlns:ds="http://schemas.openxmlformats.org/officeDocument/2006/customXml" ds:itemID="{FEB6B610-A6D6-49E3-96B6-D5561D46B112}">
+  <ds:schemaRefs>
+    <ds:schemaRef ds:uri="http://schemas.microsoft.com/sharepoint/v3/contenttype/forms"/>
+  </ds:schemaRefs>
+</ds:datastoreItem>
+</file>
+
+<file path=customXml/itemProps3.xml><?xml version="1.0" encoding="utf-8"?>
 <ds:datastoreItem xmlns:ds="http://schemas.openxmlformats.org/officeDocument/2006/customXml" ds:itemID="{4B077741-96F4-4963-97B4-37B81EC3BF78}">
   <ds:schemaRefs>
     <ds:schemaRef ds:uri="http://schemas.microsoft.com/office/2006/metadata/contentType"/>
@@ -4926,20 +6207,10 @@
 </ds:datastoreItem>
 </file>
 
-<file path=customXml/itemProps3.xml><?xml version="1.0" encoding="utf-8"?>
-<ds:datastoreItem xmlns:ds="http://schemas.openxmlformats.org/officeDocument/2006/customXml" ds:itemID="{FEB6B610-A6D6-49E3-96B6-D5561D46B112}">
+<file path=customXml/itemProps4.xml><?xml version="1.0" encoding="utf-8"?>
+<ds:datastoreItem xmlns:ds="http://schemas.openxmlformats.org/officeDocument/2006/customXml" ds:itemID="{2C53BA18-DBA6-435B-B859-AC3BE7A8B3B8}">
   <ds:schemaRefs>
-    <ds:schemaRef ds:uri="http://schemas.microsoft.com/sharepoint/v3/contenttype/forms"/>
-  </ds:schemaRefs>
-</ds:datastoreItem>
-</file>
-
-<file path=customXml/itemProps4.xml><?xml version="1.0" encoding="utf-8"?>
-<ds:datastoreItem xmlns:ds="http://schemas.openxmlformats.org/officeDocument/2006/customXml" ds:itemID="{FC71E993-84B4-48D2-950C-13C131ED85B2}">
-  <ds:schemaRefs>
-    <ds:schemaRef ds:uri="http://schemas.microsoft.com/office/2006/metadata/properties"/>
-    <ds:schemaRef ds:uri="http://schemas.microsoft.com/office/infopath/2007/PartnerControls"/>
-    <ds:schemaRef ds:uri="6cf9629a-3f6c-4f5f-bf5a-9990f6d83c58"/>
+    <ds:schemaRef ds:uri="http://schemas.openxmlformats.org/officeDocument/2006/bibliography"/>
   </ds:schemaRefs>
 </ds:datastoreItem>
 </file>
</xml_diff>